<commit_message>
Cap nhat giao dien va sua logic
</commit_message>
<xml_diff>
--- a/report.docx
+++ b/report.docx
@@ -2492,6 +2492,7 @@
     </w:p>
     <w:p>
       <w:pPr>
+        <w:jc w:val="both"/>
         <w:rPr>
           <w:rFonts w:ascii="Times New Roman" w:hAnsi="Times New Roman" w:cs="Times New Roman"/>
         </w:rPr>
@@ -2502,6 +2503,7 @@
         </w:rPr>
         <w:t>Bài toán yêu cầu xây dựng một chương trình trò chơi đối kháng giữa người và máy (AI) trên môi trường đồ họa. Mục tiêu cốt lõi là áp dụng các thuật toán tìm kiếm đối kháng (Adversarial Search) như Minimax và Alpha-Beta Pruning để tạo ra một tác tử (Agent) có khả năng tự đưa ra quyết định tối ưu dựa trên trạng thái bàn cờ hiện tại.</w:t>
       </w:r>
+      <w:bookmarkStart w:id="1" w:name="_Toc229416397"/>
     </w:p>
     <w:p>
       <w:pPr>
@@ -2514,9 +2516,9 @@
           <w:color w:val="auto"/>
           <w:sz w:val="36"/>
           <w:szCs w:val="36"/>
-        </w:rPr>
-      </w:pPr>
-      <w:bookmarkStart w:id="1" w:name="_Toc229416397"/>
+          <w:lang w:val="vi-VN"/>
+        </w:rPr>
+      </w:pPr>
       <w:r>
         <w:rPr>
           <w:rFonts w:ascii="Times New Roman" w:hAnsi="Times New Roman" w:cs="Times New Roman"/>
@@ -2525,6 +2527,7 @@
           <w:color w:val="auto"/>
           <w:sz w:val="36"/>
           <w:szCs w:val="36"/>
+          <w:lang w:val="vi-VN"/>
         </w:rPr>
         <w:t>2</w:t>
       </w:r>
@@ -2536,6 +2539,7 @@
           <w:color w:val="auto"/>
           <w:sz w:val="36"/>
           <w:szCs w:val="36"/>
+          <w:lang w:val="vi-VN"/>
         </w:rPr>
         <w:t>. LUẬT CHƠI VÀ ĐIỀU KIỆN THẮNG</w:t>
       </w:r>
@@ -2544,25 +2548,30 @@
     <w:p>
       <w:pPr>
         <w:ind w:firstLine="0"/>
-        <w:rPr>
-          <w:rFonts w:ascii="Times New Roman" w:hAnsi="Times New Roman" w:cs="Times New Roman"/>
-        </w:rPr>
-      </w:pPr>
-      <w:r>
-        <w:rPr>
-          <w:rFonts w:ascii="Times New Roman" w:hAnsi="Times New Roman" w:cs="Times New Roman"/>
+        <w:jc w:val="both"/>
+        <w:rPr>
+          <w:rFonts w:ascii="Times New Roman" w:hAnsi="Times New Roman" w:cs="Times New Roman"/>
+          <w:lang w:val="vi-VN"/>
+        </w:rPr>
+      </w:pPr>
+      <w:r>
+        <w:rPr>
+          <w:rFonts w:ascii="Times New Roman" w:hAnsi="Times New Roman" w:cs="Times New Roman"/>
+          <w:lang w:val="vi-VN"/>
         </w:rPr>
         <w:t xml:space="preserve"> </w:t>
       </w:r>
       <w:r>
         <w:rPr>
           <w:rFonts w:ascii="Times New Roman" w:hAnsi="Times New Roman" w:cs="Times New Roman"/>
+          <w:lang w:val="vi-VN"/>
         </w:rPr>
         <w:tab/>
       </w:r>
       <w:r>
         <w:rPr>
           <w:rFonts w:ascii="Times New Roman" w:hAnsi="Times New Roman" w:cs="Times New Roman"/>
+          <w:lang w:val="vi-VN"/>
         </w:rPr>
         <w:t>Luật chơi: Hai bên luân phiên đặt quân cờ của mình (X hoặc O) vào các ô trống trên bàn cờ.</w:t>
       </w:r>
@@ -2570,25 +2579,30 @@
     <w:p>
       <w:pPr>
         <w:ind w:firstLine="0"/>
-        <w:rPr>
-          <w:rFonts w:ascii="Times New Roman" w:hAnsi="Times New Roman" w:cs="Times New Roman"/>
-        </w:rPr>
-      </w:pPr>
-      <w:r>
-        <w:rPr>
-          <w:rFonts w:ascii="Times New Roman" w:hAnsi="Times New Roman" w:cs="Times New Roman"/>
+        <w:jc w:val="both"/>
+        <w:rPr>
+          <w:rFonts w:ascii="Times New Roman" w:hAnsi="Times New Roman" w:cs="Times New Roman"/>
+          <w:lang w:val="vi-VN"/>
+        </w:rPr>
+      </w:pPr>
+      <w:r>
+        <w:rPr>
+          <w:rFonts w:ascii="Times New Roman" w:hAnsi="Times New Roman" w:cs="Times New Roman"/>
+          <w:lang w:val="vi-VN"/>
         </w:rPr>
         <w:t xml:space="preserve"> </w:t>
       </w:r>
       <w:r>
         <w:rPr>
           <w:rFonts w:ascii="Times New Roman" w:hAnsi="Times New Roman" w:cs="Times New Roman"/>
+          <w:lang w:val="vi-VN"/>
         </w:rPr>
         <w:tab/>
       </w:r>
       <w:r>
         <w:rPr>
           <w:rFonts w:ascii="Times New Roman" w:hAnsi="Times New Roman" w:cs="Times New Roman"/>
+          <w:lang w:val="vi-VN"/>
         </w:rPr>
         <w:t>Điều kiện thắng: Theo yêu cầu cụ thể của đề bài, bên nào tạo được một chuỗi 4 quân cờ liên tiếp (hàng ngang, hàng dọc hoặc đường chéo) sẽ giành chiến thắng.</w:t>
       </w:r>
@@ -2596,16 +2610,19 @@
     <w:p>
       <w:pPr>
         <w:ind w:firstLine="720"/>
-        <w:rPr>
-          <w:rFonts w:ascii="Times New Roman" w:hAnsi="Times New Roman" w:cs="Times New Roman"/>
-        </w:rPr>
-      </w:pPr>
-      <w:r>
-        <w:rPr>
-          <w:rFonts w:ascii="Times New Roman" w:hAnsi="Times New Roman" w:cs="Times New Roman"/>
+        <w:jc w:val="both"/>
+        <w:rPr>
+          <w:rFonts w:ascii="Times New Roman" w:hAnsi="Times New Roman" w:cs="Times New Roman"/>
+        </w:rPr>
+      </w:pPr>
+      <w:r>
+        <w:rPr>
+          <w:rFonts w:ascii="Times New Roman" w:hAnsi="Times New Roman" w:cs="Times New Roman"/>
+          <w:lang w:val="vi-VN"/>
         </w:rPr>
         <w:t>Điều kiện hòa: Trận đấu kết thúc hòa khi tất cả các ô trên bàn cờ đã được lấp đầy mà không bên nào thỏa mãn điều kiện thắng.</w:t>
       </w:r>
+      <w:bookmarkStart w:id="2" w:name="_Toc229416398"/>
     </w:p>
     <w:p>
       <w:pPr>
@@ -2618,9 +2635,9 @@
           <w:color w:val="auto"/>
           <w:sz w:val="36"/>
           <w:szCs w:val="36"/>
-        </w:rPr>
-      </w:pPr>
-      <w:bookmarkStart w:id="2" w:name="_Toc229416398"/>
+          <w:lang w:val="vi-VN"/>
+        </w:rPr>
+      </w:pPr>
       <w:r>
         <w:rPr>
           <w:rFonts w:ascii="Times New Roman" w:hAnsi="Times New Roman" w:cs="Times New Roman"/>
@@ -2629,6 +2646,7 @@
           <w:color w:val="auto"/>
           <w:sz w:val="36"/>
           <w:szCs w:val="36"/>
+          <w:lang w:val="vi-VN"/>
         </w:rPr>
         <w:t>3. CÁCH BIỂU DIỄN TRẠNG THÁI BÀN CỜ</w:t>
       </w:r>
@@ -2643,6 +2661,7 @@
           <w:b/>
           <w:bCs/>
           <w:color w:val="auto"/>
+          <w:lang w:val="vi-VN"/>
         </w:rPr>
       </w:pPr>
       <w:bookmarkStart w:id="3" w:name="_Toc229416399"/>
@@ -2652,6 +2671,7 @@
           <w:b/>
           <w:bCs/>
           <w:color w:val="auto"/>
+          <w:lang w:val="vi-VN"/>
         </w:rPr>
         <w:t>3.1 Xây dựng trạng thái bàn cờ</w:t>
       </w:r>
@@ -2660,13 +2680,16 @@
     <w:p>
       <w:pPr>
         <w:ind w:firstLine="720"/>
-        <w:rPr>
-          <w:rFonts w:ascii="Times New Roman" w:hAnsi="Times New Roman" w:cs="Times New Roman"/>
-        </w:rPr>
-      </w:pPr>
-      <w:r>
-        <w:rPr>
-          <w:rFonts w:ascii="Times New Roman" w:hAnsi="Times New Roman" w:cs="Times New Roman"/>
+        <w:jc w:val="both"/>
+        <w:rPr>
+          <w:rFonts w:ascii="Times New Roman" w:hAnsi="Times New Roman" w:cs="Times New Roman"/>
+          <w:lang w:val="vi-VN"/>
+        </w:rPr>
+      </w:pPr>
+      <w:r>
+        <w:rPr>
+          <w:rFonts w:ascii="Times New Roman" w:hAnsi="Times New Roman" w:cs="Times New Roman"/>
+          <w:lang w:val="vi-VN"/>
         </w:rPr>
         <w:t>Chương trình sử dụng mô hình đồng bộ giữa giao diện đồ họa Tkinter và dữ liệu logic (Mảng hai chiều).</w:t>
       </w:r>
@@ -2674,13 +2697,16 @@
     <w:p>
       <w:pPr>
         <w:ind w:firstLine="720"/>
-        <w:rPr>
-          <w:rFonts w:ascii="Times New Roman" w:hAnsi="Times New Roman" w:cs="Times New Roman"/>
-        </w:rPr>
-      </w:pPr>
-      <w:r>
-        <w:rPr>
-          <w:rFonts w:ascii="Times New Roman" w:hAnsi="Times New Roman" w:cs="Times New Roman"/>
+        <w:jc w:val="both"/>
+        <w:rPr>
+          <w:rFonts w:ascii="Times New Roman" w:hAnsi="Times New Roman" w:cs="Times New Roman"/>
+          <w:lang w:val="vi-VN"/>
+        </w:rPr>
+      </w:pPr>
+      <w:r>
+        <w:rPr>
+          <w:rFonts w:ascii="Times New Roman" w:hAnsi="Times New Roman" w:cs="Times New Roman"/>
+          <w:lang w:val="vi-VN"/>
         </w:rPr>
         <w:t>Cấu trúc mảng logic: Một danh sách lồng nhau (list of lists) trong Python được sử dụng để lưu trữ giá trị tại mỗi tọa độ (r, c) trên bàn cờ 9x9. Mỗi phần tử trong mảng này đại diện cho một ô cờ và chỉ nhận một trong ba trạng thái: trống, quân "X" (Người), hoặc quân "O" (Máy).</w:t>
       </w:r>
@@ -2688,13 +2714,16 @@
     <w:p>
       <w:pPr>
         <w:ind w:firstLine="720"/>
-        <w:rPr>
-          <w:rFonts w:ascii="Times New Roman" w:hAnsi="Times New Roman" w:cs="Times New Roman"/>
-        </w:rPr>
-      </w:pPr>
-      <w:r>
-        <w:rPr>
-          <w:rFonts w:ascii="Times New Roman" w:hAnsi="Times New Roman" w:cs="Times New Roman"/>
+        <w:jc w:val="both"/>
+        <w:rPr>
+          <w:rFonts w:ascii="Times New Roman" w:hAnsi="Times New Roman" w:cs="Times New Roman"/>
+          <w:lang w:val="vi-VN"/>
+        </w:rPr>
+      </w:pPr>
+      <w:r>
+        <w:rPr>
+          <w:rFonts w:ascii="Times New Roman" w:hAnsi="Times New Roman" w:cs="Times New Roman"/>
+          <w:lang w:val="vi-VN"/>
         </w:rPr>
         <w:t>Cấu trúc giao diện: Mỗi ô cờ trên màn hình là một đối tượng Button của thư viện Tkinter. Các nút này được quản lý trong một mảng hai chiều tương ứng để dễ dàng truy xuất và cập nhật hiển thị khi có nước đi mới.</w:t>
       </w:r>
@@ -2702,13 +2731,16 @@
     <w:p>
       <w:pPr>
         <w:ind w:firstLine="720"/>
-        <w:rPr>
-          <w:rFonts w:ascii="Times New Roman" w:hAnsi="Times New Roman" w:cs="Times New Roman"/>
-        </w:rPr>
-      </w:pPr>
-      <w:r>
-        <w:rPr>
-          <w:rFonts w:ascii="Times New Roman" w:hAnsi="Times New Roman" w:cs="Times New Roman"/>
+        <w:jc w:val="both"/>
+        <w:rPr>
+          <w:rFonts w:ascii="Times New Roman" w:hAnsi="Times New Roman" w:cs="Times New Roman"/>
+          <w:lang w:val="vi-VN"/>
+        </w:rPr>
+      </w:pPr>
+      <w:r>
+        <w:rPr>
+          <w:rFonts w:ascii="Times New Roman" w:hAnsi="Times New Roman" w:cs="Times New Roman"/>
+          <w:lang w:val="vi-VN"/>
         </w:rPr>
         <w:t xml:space="preserve">Cơ chế truy xuất: Khi thuật toán AI cần tính toán, chương trình sẽ gọi hàm </w:t>
       </w:r>
@@ -2719,12 +2751,14 @@
           <w:bCs/>
           <w:i/>
           <w:iCs/>
+          <w:lang w:val="vi-VN"/>
         </w:rPr>
         <w:t>get_board_state</w:t>
       </w:r>
       <w:r>
         <w:rPr>
           <w:rFonts w:ascii="Times New Roman" w:hAnsi="Times New Roman" w:cs="Times New Roman"/>
+          <w:lang w:val="vi-VN"/>
         </w:rPr>
         <w:t xml:space="preserve"> để "quét" toàn bộ văn bản hiển thị trên các nút bấm và chuyển đổi chúng thành một mảng dữ liệu thuần túy, giúp tách biệt phần hiển thị và phần xử lý thuật toán.</w:t>
       </w:r>
@@ -2732,6 +2766,7 @@
     <w:p>
       <w:pPr>
         <w:ind w:firstLine="0"/>
+        <w:jc w:val="center"/>
         <w:rPr>
           <w:rFonts w:ascii="Times New Roman" w:hAnsi="Times New Roman" w:cs="Times New Roman"/>
         </w:rPr>
@@ -2743,9 +2778,9 @@
         </w:rPr>
         <w:lastRenderedPageBreak/>
         <w:drawing>
-          <wp:inline distT="0" distB="0" distL="0" distR="0" wp14:anchorId="4B4333CE" wp14:editId="7E56BBA7">
-            <wp:extent cx="4452359" cy="2022505"/>
-            <wp:effectExtent l="0" t="0" r="5715" b="0"/>
+          <wp:inline distT="0" distB="0" distL="0" distR="0" wp14:anchorId="4B4333CE" wp14:editId="1A0D81C6">
+            <wp:extent cx="5023413" cy="2281909"/>
+            <wp:effectExtent l="0" t="0" r="6350" b="4445"/>
             <wp:docPr id="1035146093" name="Picture 1"/>
             <wp:cNvGraphicFramePr>
               <a:graphicFrameLocks xmlns:a="http://schemas.openxmlformats.org/drawingml/2006/main" noChangeAspect="1"/>
@@ -2766,7 +2801,7 @@
                   <pic:spPr>
                     <a:xfrm>
                       <a:off x="0" y="0"/>
-                      <a:ext cx="4469468" cy="2030277"/>
+                      <a:ext cx="5059026" cy="2298087"/>
                     </a:xfrm>
                     <a:prstGeom prst="rect">
                       <a:avLst/>
@@ -2808,6 +2843,7 @@
     </w:p>
     <w:p>
       <w:pPr>
+        <w:jc w:val="both"/>
         <w:rPr>
           <w:rFonts w:ascii="Times New Roman" w:hAnsi="Times New Roman" w:cs="Times New Roman"/>
         </w:rPr>
@@ -2821,6 +2857,7 @@
     </w:p>
     <w:p>
       <w:pPr>
+        <w:jc w:val="both"/>
         <w:rPr>
           <w:rFonts w:ascii="Times New Roman" w:hAnsi="Times New Roman" w:cs="Times New Roman"/>
         </w:rPr>
@@ -2834,6 +2871,7 @@
     </w:p>
     <w:p>
       <w:pPr>
+        <w:jc w:val="both"/>
         <w:rPr>
           <w:rFonts w:ascii="Times New Roman" w:hAnsi="Times New Roman" w:cs="Times New Roman"/>
         </w:rPr>
@@ -2848,6 +2886,7 @@
     <w:p>
       <w:pPr>
         <w:ind w:firstLine="0"/>
+        <w:jc w:val="center"/>
         <w:rPr>
           <w:rFonts w:ascii="Times New Roman" w:hAnsi="Times New Roman" w:cs="Times New Roman"/>
         </w:rPr>
@@ -2857,9 +2896,9 @@
           <w:noProof/>
         </w:rPr>
         <w:drawing>
-          <wp:inline distT="0" distB="0" distL="0" distR="0" wp14:anchorId="668E11E7" wp14:editId="70106FED">
-            <wp:extent cx="4082143" cy="2805123"/>
-            <wp:effectExtent l="0" t="0" r="0" b="0"/>
+          <wp:inline distT="0" distB="0" distL="0" distR="0" wp14:anchorId="668E11E7" wp14:editId="58430260">
+            <wp:extent cx="4926873" cy="3385595"/>
+            <wp:effectExtent l="0" t="0" r="7620" b="5715"/>
             <wp:docPr id="1889078534" name="Picture 1"/>
             <wp:cNvGraphicFramePr>
               <a:graphicFrameLocks xmlns:a="http://schemas.openxmlformats.org/drawingml/2006/main" noChangeAspect="1"/>
@@ -2880,7 +2919,7 @@
                   <pic:spPr>
                     <a:xfrm>
                       <a:off x="0" y="0"/>
-                      <a:ext cx="4085022" cy="2807101"/>
+                      <a:ext cx="4944014" cy="3397373"/>
                     </a:xfrm>
                     <a:prstGeom prst="rect">
                       <a:avLst/>
@@ -2919,6 +2958,7 @@
     </w:p>
     <w:p>
       <w:pPr>
+        <w:jc w:val="both"/>
         <w:rPr>
           <w:rFonts w:ascii="Times New Roman" w:hAnsi="Times New Roman" w:cs="Times New Roman"/>
         </w:rPr>
@@ -2932,6 +2972,7 @@
     </w:p>
     <w:p>
       <w:pPr>
+        <w:jc w:val="both"/>
         <w:rPr>
           <w:rFonts w:ascii="Times New Roman" w:hAnsi="Times New Roman" w:cs="Times New Roman"/>
         </w:rPr>
@@ -2945,6 +2986,7 @@
     </w:p>
     <w:p>
       <w:pPr>
+        <w:jc w:val="both"/>
         <w:rPr>
           <w:rFonts w:ascii="Times New Roman" w:hAnsi="Times New Roman" w:cs="Times New Roman"/>
         </w:rPr>
@@ -2958,6 +3000,7 @@
     </w:p>
     <w:p>
       <w:pPr>
+        <w:jc w:val="both"/>
         <w:rPr>
           <w:rFonts w:ascii="Times New Roman" w:hAnsi="Times New Roman" w:cs="Times New Roman"/>
         </w:rPr>
@@ -2972,6 +3015,7 @@
     <w:p>
       <w:pPr>
         <w:ind w:firstLine="0"/>
+        <w:jc w:val="center"/>
         <w:rPr>
           <w:rFonts w:ascii="Times New Roman" w:hAnsi="Times New Roman" w:cs="Times New Roman"/>
         </w:rPr>
@@ -2982,9 +3026,9 @@
           <w:noProof/>
         </w:rPr>
         <w:drawing>
-          <wp:inline distT="0" distB="0" distL="0" distR="0" wp14:anchorId="44B2C3C5" wp14:editId="6B33E9B1">
-            <wp:extent cx="4204531" cy="1617947"/>
-            <wp:effectExtent l="0" t="0" r="5715" b="1905"/>
+          <wp:inline distT="0" distB="0" distL="0" distR="0" wp14:anchorId="44B2C3C5" wp14:editId="3B264CE2">
+            <wp:extent cx="5910511" cy="2274426"/>
+            <wp:effectExtent l="0" t="0" r="0" b="0"/>
             <wp:docPr id="2133447368" name="Picture 1"/>
             <wp:cNvGraphicFramePr>
               <a:graphicFrameLocks xmlns:a="http://schemas.openxmlformats.org/drawingml/2006/main" noChangeAspect="1"/>
@@ -3005,7 +3049,7 @@
                   <pic:spPr>
                     <a:xfrm>
                       <a:off x="0" y="0"/>
-                      <a:ext cx="4224761" cy="1625732"/>
+                      <a:ext cx="5967541" cy="2296372"/>
                     </a:xfrm>
                     <a:prstGeom prst="rect">
                       <a:avLst/>
@@ -3058,7 +3102,8 @@
     </w:p>
     <w:p>
       <w:pPr>
-        <w:ind w:firstLine="0"/>
+        <w:ind w:firstLine="720"/>
+        <w:jc w:val="both"/>
         <w:rPr>
           <w:rFonts w:ascii="Times New Roman" w:hAnsi="Times New Roman" w:cs="Times New Roman"/>
         </w:rPr>
@@ -3080,7 +3125,8 @@
     </w:p>
     <w:p>
       <w:pPr>
-        <w:ind w:firstLine="0"/>
+        <w:ind w:firstLine="720"/>
+        <w:jc w:val="both"/>
         <w:rPr>
           <w:rFonts w:ascii="Times New Roman" w:hAnsi="Times New Roman" w:cs="Times New Roman"/>
         </w:rPr>
@@ -3102,23 +3148,19 @@
     </w:p>
     <w:p>
       <w:pPr>
-        <w:ind w:firstLine="0"/>
-        <w:rPr>
-          <w:rFonts w:ascii="Times New Roman" w:hAnsi="Times New Roman" w:cs="Times New Roman"/>
-        </w:rPr>
-      </w:pPr>
-      <w:r>
-        <w:rPr>
-          <w:rFonts w:ascii="Times New Roman" w:hAnsi="Times New Roman" w:cs="Times New Roman"/>
-        </w:rPr>
-        <w:t xml:space="preserve"> </w:t>
-      </w:r>
+        <w:ind w:firstLine="720"/>
+        <w:jc w:val="both"/>
+        <w:rPr>
+          <w:rFonts w:ascii="Times New Roman" w:hAnsi="Times New Roman" w:cs="Times New Roman"/>
+        </w:rPr>
+      </w:pPr>
       <w:r>
         <w:rPr>
           <w:rFonts w:ascii="Times New Roman" w:hAnsi="Times New Roman" w:cs="Times New Roman"/>
           <w:b/>
           <w:bCs/>
         </w:rPr>
+        <w:lastRenderedPageBreak/>
         <w:t>Quá trình tối đa hóa (Maximizing)</w:t>
       </w:r>
       <w:r>
@@ -3130,9 +3172,10 @@
     </w:p>
     <w:p>
       <w:pPr>
-        <w:ind w:firstLine="0"/>
-        <w:rPr>
-          <w:rFonts w:ascii="Times New Roman" w:hAnsi="Times New Roman" w:cs="Times New Roman"/>
+        <w:jc w:val="both"/>
+        <w:rPr>
+          <w:rFonts w:ascii="Times New Roman" w:hAnsi="Times New Roman" w:cs="Times New Roman"/>
+          <w:lang w:val="vi-VN"/>
         </w:rPr>
       </w:pPr>
       <w:r>
@@ -3147,20 +3190,23 @@
         <w:rPr>
           <w:rFonts w:ascii="Times New Roman" w:hAnsi="Times New Roman" w:cs="Times New Roman"/>
         </w:rPr>
-        <w:t xml:space="preserve">: Khi giả lập lượt của Người chơi, thuật toán thực hiện các nước đi thử nghiệm cho con người và tìm kiếm giá trị nhỏ nhất từ các nhánh phản hồi của </w:t>
-      </w:r>
-      <w:r>
-        <w:rPr>
-          <w:rFonts w:ascii="Times New Roman" w:hAnsi="Times New Roman" w:cs="Times New Roman"/>
-        </w:rPr>
-        <w:lastRenderedPageBreak/>
-        <w:t>máy. Điều này giúp AI chuẩn bị phương án đối phó cho tình huống xấu nhất mà người chơi có thể gây ra.</w:t>
+        <w:t>: Khi giả lập lượt của Người chơi, thuật toán thực hiện các nước đi thử nghiệm cho con người và tìm kiếm giá trị nhỏ nhất từ các nhánh phản hồi của máy. Điều này giúp AI chuẩn bị phương án đối phó cho tình huống xấu nhất mà người chơi có thể gây ra.</w:t>
       </w:r>
     </w:p>
     <w:p>
       <w:pPr>
-        <w:rPr>
-          <w:rFonts w:ascii="Times New Roman" w:hAnsi="Times New Roman" w:cs="Times New Roman"/>
+        <w:jc w:val="both"/>
+        <w:rPr>
+          <w:rFonts w:ascii="Times New Roman" w:hAnsi="Times New Roman" w:cs="Times New Roman"/>
+          <w:lang w:val="vi-VN"/>
+        </w:rPr>
+      </w:pPr>
+    </w:p>
+    <w:p>
+      <w:pPr>
+        <w:rPr>
+          <w:rFonts w:ascii="Times New Roman" w:hAnsi="Times New Roman" w:cs="Times New Roman"/>
+          <w:lang w:val="vi-VN"/>
         </w:rPr>
       </w:pPr>
       <w:r>
@@ -3168,9 +3214,9 @@
           <w:noProof/>
         </w:rPr>
         <w:drawing>
-          <wp:inline distT="0" distB="0" distL="0" distR="0" wp14:anchorId="04B91893" wp14:editId="64373771">
-            <wp:extent cx="5760720" cy="3140075"/>
-            <wp:effectExtent l="0" t="0" r="0" b="3175"/>
+          <wp:inline distT="0" distB="0" distL="0" distR="0" wp14:anchorId="04B91893" wp14:editId="1ED0B4B9">
+            <wp:extent cx="5000263" cy="2725562"/>
+            <wp:effectExtent l="0" t="0" r="0" b="0"/>
             <wp:docPr id="1126536188" name="Picture 1"/>
             <wp:cNvGraphicFramePr>
               <a:graphicFrameLocks xmlns:a="http://schemas.openxmlformats.org/drawingml/2006/main" noChangeAspect="1"/>
@@ -3191,7 +3237,7 @@
                   <pic:spPr>
                     <a:xfrm>
                       <a:off x="0" y="0"/>
-                      <a:ext cx="5760720" cy="3140075"/>
+                      <a:ext cx="5008159" cy="2729866"/>
                     </a:xfrm>
                     <a:prstGeom prst="rect">
                       <a:avLst/>
@@ -3203,6 +3249,7 @@
           </wp:inline>
         </w:drawing>
       </w:r>
+      <w:bookmarkStart w:id="7" w:name="_Toc229416404"/>
     </w:p>
     <w:p>
       <w:pPr>
@@ -3213,15 +3260,16 @@
           <w:b/>
           <w:bCs/>
           <w:color w:val="auto"/>
-        </w:rPr>
-      </w:pPr>
-      <w:bookmarkStart w:id="7" w:name="_Toc229416404"/>
+          <w:lang w:val="vi-VN"/>
+        </w:rPr>
+      </w:pPr>
       <w:r>
         <w:rPr>
           <w:rFonts w:ascii="Times New Roman" w:hAnsi="Times New Roman" w:cs="Times New Roman"/>
           <w:b/>
           <w:bCs/>
           <w:color w:val="auto"/>
+          <w:lang w:val="vi-VN"/>
         </w:rPr>
         <w:t>7. THUẬT TOÁN ALPHA-BETA ĐÃ CÀI ĐẶT</w:t>
       </w:r>
@@ -3229,39 +3277,48 @@
     </w:p>
     <w:p>
       <w:pPr>
-        <w:rPr>
-          <w:rFonts w:ascii="Times New Roman" w:hAnsi="Times New Roman" w:cs="Times New Roman"/>
-        </w:rPr>
-      </w:pPr>
-      <w:r>
-        <w:rPr>
-          <w:rFonts w:ascii="Times New Roman" w:hAnsi="Times New Roman" w:cs="Times New Roman"/>
+        <w:jc w:val="both"/>
+        <w:rPr>
+          <w:rFonts w:ascii="Times New Roman" w:hAnsi="Times New Roman" w:cs="Times New Roman"/>
+          <w:lang w:val="vi-VN"/>
+        </w:rPr>
+      </w:pPr>
+      <w:r>
+        <w:rPr>
+          <w:rFonts w:ascii="Times New Roman" w:hAnsi="Times New Roman" w:cs="Times New Roman"/>
+          <w:lang w:val="vi-VN"/>
         </w:rPr>
         <w:t>Nguyên lý cải tiến: Thuật toán Alpha-Beta Pruning (Cắt tỉa Alpha-Beta) là một biến thể nâng cao của Minimax, được thiết kế để giảm bớt số lượng nút phải duyệt trên cây quyết định mà không làm thay đổi kết quả cuối cùng của nước đi tối ưu. Bằng cách loại bỏ những nhánh mà kết quả chắc chắn sẽ tệ hơn các nhánh đã duyệt trước đó, AI tiết kiệm được đáng kể tài nguyên hệ thống và thời gian tính toán.</w:t>
       </w:r>
     </w:p>
     <w:p>
       <w:pPr>
-        <w:rPr>
-          <w:rFonts w:ascii="Times New Roman" w:hAnsi="Times New Roman" w:cs="Times New Roman"/>
-        </w:rPr>
-      </w:pPr>
-      <w:r>
-        <w:rPr>
-          <w:rFonts w:ascii="Times New Roman" w:hAnsi="Times New Roman" w:cs="Times New Roman"/>
+        <w:jc w:val="both"/>
+        <w:rPr>
+          <w:rFonts w:ascii="Times New Roman" w:hAnsi="Times New Roman" w:cs="Times New Roman"/>
+          <w:lang w:val="vi-VN"/>
+        </w:rPr>
+      </w:pPr>
+      <w:r>
+        <w:rPr>
+          <w:rFonts w:ascii="Times New Roman" w:hAnsi="Times New Roman" w:cs="Times New Roman"/>
+          <w:lang w:val="vi-VN"/>
         </w:rPr>
         <w:t xml:space="preserve"> Tham số Alpha và Beta: Thuật toán sử dụng hai giá trị biên để quản lý quá trình tìm kiếm. Alpha đại diện cho giá trị lớn nhất mà người chơi Max (AI) có thể đảm bảo đạt được, trong khi Beta đại diện cho giá trị nhỏ nhất mà người chơi Min (Người) có thể ép đối thủ phải nhận. Các giá trị này được cập nhật liên tục xuyên suốt quá trình đệ quy qua các tầng của cây tìm kiếm.</w:t>
       </w:r>
     </w:p>
     <w:p>
       <w:pPr>
-        <w:rPr>
-          <w:rFonts w:ascii="Times New Roman" w:hAnsi="Times New Roman" w:cs="Times New Roman"/>
-        </w:rPr>
-      </w:pPr>
-      <w:r>
-        <w:rPr>
-          <w:rFonts w:ascii="Times New Roman" w:hAnsi="Times New Roman" w:cs="Times New Roman"/>
+        <w:jc w:val="both"/>
+        <w:rPr>
+          <w:rFonts w:ascii="Times New Roman" w:hAnsi="Times New Roman" w:cs="Times New Roman"/>
+          <w:lang w:val="vi-VN"/>
+        </w:rPr>
+      </w:pPr>
+      <w:r>
+        <w:rPr>
+          <w:rFonts w:ascii="Times New Roman" w:hAnsi="Times New Roman" w:cs="Times New Roman"/>
+          <w:lang w:val="vi-VN"/>
         </w:rPr>
         <w:t xml:space="preserve"> Cơ chế cắt tỉa (Pruning): Trong quá trình duyệt, nếu tại một nhánh con, giá trị Beta (giá trị tốt nhất của người chơi Min) trở nên nhỏ hơn hoặc bằng Alpha (giá trị tốt nhất của người chơi Max), hệ thống sẽ ngay lập tức ngừng duyệt các nhánh còn lại của nút đó. Điều này dựa trên logic rằng người chơi Max sẽ không bao giờ chọn nhánh này vì đã tìm thấy một phương án khác tốt hơn trước đó.</w:t>
       </w:r>
@@ -3269,6 +3326,7 @@
     <w:p>
       <w:pPr>
         <w:ind w:firstLine="0"/>
+        <w:jc w:val="center"/>
         <w:rPr>
           <w:rFonts w:ascii="Times New Roman" w:hAnsi="Times New Roman" w:cs="Times New Roman"/>
         </w:rPr>
@@ -3279,9 +3337,9 @@
         </w:rPr>
         <w:lastRenderedPageBreak/>
         <w:drawing>
-          <wp:inline distT="0" distB="0" distL="0" distR="0" wp14:anchorId="6CD07B9B" wp14:editId="101E5FBB">
-            <wp:extent cx="5486400" cy="3513062"/>
-            <wp:effectExtent l="0" t="0" r="0" b="0"/>
+          <wp:inline distT="0" distB="0" distL="0" distR="0" wp14:anchorId="6CD07B9B" wp14:editId="6CEEC678">
+            <wp:extent cx="4456253" cy="2853436"/>
+            <wp:effectExtent l="0" t="0" r="1905" b="4445"/>
             <wp:docPr id="1937012104" name="Picture 1"/>
             <wp:cNvGraphicFramePr>
               <a:graphicFrameLocks xmlns:a="http://schemas.openxmlformats.org/drawingml/2006/main" noChangeAspect="1"/>
@@ -3302,7 +3360,7 @@
                   <pic:spPr>
                     <a:xfrm>
                       <a:off x="0" y="0"/>
-                      <a:ext cx="5488988" cy="3514719"/>
+                      <a:ext cx="4470104" cy="2862305"/>
                     </a:xfrm>
                     <a:prstGeom prst="rect">
                       <a:avLst/>
@@ -3368,6 +3426,7 @@
     <w:p>
       <w:pPr>
         <w:ind w:firstLine="720"/>
+        <w:jc w:val="both"/>
         <w:rPr>
           <w:rFonts w:ascii="Times New Roman" w:hAnsi="Times New Roman" w:cs="Times New Roman"/>
         </w:rPr>
@@ -3453,6 +3512,7 @@
     <w:p>
       <w:pPr>
         <w:ind w:firstLine="720"/>
+        <w:jc w:val="both"/>
         <w:rPr>
           <w:rFonts w:ascii="Times New Roman" w:hAnsi="Times New Roman" w:cs="Times New Roman"/>
         </w:rPr>
@@ -3467,6 +3527,7 @@
     <w:p>
       <w:pPr>
         <w:ind w:firstLine="720"/>
+        <w:jc w:val="both"/>
         <w:rPr>
           <w:rFonts w:ascii="Times New Roman" w:hAnsi="Times New Roman" w:cs="Times New Roman"/>
         </w:rPr>
@@ -3944,13 +4005,13 @@
           <w:bCs/>
           <w:color w:val="auto"/>
         </w:rPr>
-        <w:lastRenderedPageBreak/>
         <w:t>8.3. Chiến lược tấn công và phòng thủ</w:t>
       </w:r>
       <w:bookmarkEnd w:id="11"/>
     </w:p>
     <w:p>
       <w:pPr>
+        <w:jc w:val="both"/>
         <w:rPr>
           <w:rFonts w:ascii="Times New Roman" w:hAnsi="Times New Roman" w:cs="Times New Roman"/>
         </w:rPr>
@@ -3974,14 +4035,16 @@
           <w:ilvl w:val="0"/>
           <w:numId w:val="42"/>
         </w:numPr>
-        <w:rPr>
-          <w:rFonts w:ascii="Times New Roman" w:hAnsi="Times New Roman" w:cs="Times New Roman"/>
-        </w:rPr>
-      </w:pPr>
-      <w:r>
-        <w:rPr>
-          <w:rFonts w:ascii="Times New Roman" w:hAnsi="Times New Roman" w:cs="Times New Roman"/>
-        </w:rPr>
+        <w:jc w:val="both"/>
+        <w:rPr>
+          <w:rFonts w:ascii="Times New Roman" w:hAnsi="Times New Roman" w:cs="Times New Roman"/>
+        </w:rPr>
+      </w:pPr>
+      <w:r>
+        <w:rPr>
+          <w:rFonts w:ascii="Times New Roman" w:hAnsi="Times New Roman" w:cs="Times New Roman"/>
+        </w:rPr>
+        <w:lastRenderedPageBreak/>
         <w:t>Tấn công (Máy): Nếu tạo được chuỗi 3 thoáng, cộng 50.000 điểm.</w:t>
       </w:r>
     </w:p>
@@ -3991,6 +4054,7 @@
           <w:ilvl w:val="0"/>
           <w:numId w:val="42"/>
         </w:numPr>
+        <w:jc w:val="both"/>
         <w:rPr>
           <w:rFonts w:ascii="Times New Roman" w:hAnsi="Times New Roman" w:cs="Times New Roman"/>
         </w:rPr>
@@ -4004,6 +4068,7 @@
     </w:p>
     <w:p>
       <w:pPr>
+        <w:jc w:val="both"/>
         <w:rPr>
           <w:rFonts w:ascii="Times New Roman" w:hAnsi="Times New Roman" w:cs="Times New Roman"/>
         </w:rPr>
@@ -4041,6 +4106,7 @@
     <w:p>
       <w:pPr>
         <w:ind w:firstLine="0"/>
+        <w:jc w:val="both"/>
         <w:rPr>
           <w:rFonts w:ascii="Times New Roman" w:hAnsi="Times New Roman" w:cs="Times New Roman"/>
         </w:rPr>
@@ -4055,6 +4121,7 @@
     <w:p>
       <w:pPr>
         <w:ind w:left="360" w:firstLine="0"/>
+        <w:jc w:val="both"/>
         <w:rPr>
           <w:rFonts w:ascii="Times New Roman" w:hAnsi="Times New Roman" w:cs="Times New Roman"/>
         </w:rPr>
@@ -4085,6 +4152,7 @@
     <w:p>
       <w:pPr>
         <w:ind w:left="360" w:firstLine="0"/>
+        <w:jc w:val="both"/>
         <w:rPr>
           <w:rFonts w:ascii="Times New Roman" w:hAnsi="Times New Roman" w:cs="Times New Roman"/>
         </w:rPr>
@@ -4122,6 +4190,7 @@
     <w:p>
       <w:pPr>
         <w:ind w:firstLine="0"/>
+        <w:jc w:val="both"/>
         <w:rPr>
           <w:rFonts w:ascii="Times New Roman" w:hAnsi="Times New Roman" w:cs="Times New Roman"/>
         </w:rPr>
@@ -4136,6 +4205,7 @@
     <w:p>
       <w:pPr>
         <w:ind w:left="360" w:firstLine="0"/>
+        <w:jc w:val="both"/>
         <w:rPr>
           <w:rFonts w:ascii="Times New Roman" w:hAnsi="Times New Roman" w:cs="Times New Roman"/>
         </w:rPr>
@@ -4150,6 +4220,7 @@
     <w:p>
       <w:pPr>
         <w:ind w:left="360" w:firstLine="0"/>
+        <w:jc w:val="both"/>
         <w:rPr>
           <w:rFonts w:ascii="Times New Roman" w:hAnsi="Times New Roman" w:cs="Times New Roman"/>
         </w:rPr>
@@ -4172,6 +4243,7 @@
           <w:color w:val="auto"/>
           <w:sz w:val="36"/>
           <w:szCs w:val="36"/>
+          <w:lang w:val="vi-VN"/>
         </w:rPr>
       </w:pPr>
       <w:r>
@@ -4182,6 +4254,7 @@
           <w:color w:val="auto"/>
           <w:sz w:val="36"/>
           <w:szCs w:val="36"/>
+          <w:lang w:val="vi-VN"/>
         </w:rPr>
         <w:t xml:space="preserve">9. </w:t>
       </w:r>
@@ -4193,26 +4266,18 @@
           <w:color w:val="auto"/>
           <w:sz w:val="36"/>
           <w:szCs w:val="36"/>
-        </w:rPr>
-        <w:t xml:space="preserve">Giao diện và </w:t>
-      </w:r>
-      <w:r>
-        <w:rPr>
-          <w:rFonts w:ascii="Times New Roman" w:hAnsi="Times New Roman" w:cs="Times New Roman"/>
+          <w:lang w:val="vi-VN"/>
+        </w:rPr>
+        <w:t>Giao diện và sơ đồ nguyên lý</w:t>
+      </w:r>
+    </w:p>
+    <w:p>
+      <w:pPr>
+        <w:jc w:val="center"/>
+        <w:rPr>
           <w:b/>
           <w:bCs/>
-          <w:color w:val="auto"/>
-          <w:sz w:val="36"/>
-          <w:szCs w:val="36"/>
-        </w:rPr>
-        <w:t>lưu đồ thuật toán</w:t>
-      </w:r>
-    </w:p>
-    <w:p>
-      <w:pPr>
-        <w:rPr>
-          <w:b/>
-          <w:bCs/>
+          <w:lang w:val="vi-VN"/>
         </w:rPr>
       </w:pPr>
       <w:r>
@@ -4221,18 +4286,10 @@
           <w:noProof/>
         </w:rPr>
         <w:drawing>
-          <wp:anchor distT="0" distB="0" distL="114300" distR="114300" simplePos="0" relativeHeight="251665408" behindDoc="0" locked="0" layoutInCell="1" allowOverlap="1" wp14:anchorId="13AA2DDD" wp14:editId="5752379A">
-            <wp:simplePos x="0" y="0"/>
-            <wp:positionH relativeFrom="margin">
-              <wp:posOffset>3232785</wp:posOffset>
-            </wp:positionH>
-            <wp:positionV relativeFrom="paragraph">
-              <wp:posOffset>50165</wp:posOffset>
-            </wp:positionV>
-            <wp:extent cx="2269490" cy="1539240"/>
-            <wp:effectExtent l="0" t="0" r="0" b="3810"/>
-            <wp:wrapSquare wrapText="bothSides"/>
-            <wp:docPr id="2079656963" name="Picture 1"/>
+          <wp:inline distT="0" distB="0" distL="0" distR="0" wp14:anchorId="6C284C79" wp14:editId="6EC6012C">
+            <wp:extent cx="4966370" cy="3593939"/>
+            <wp:effectExtent l="0" t="0" r="5715" b="6985"/>
+            <wp:docPr id="1572578045" name="Picture 1"/>
             <wp:cNvGraphicFramePr>
               <a:graphicFrameLocks xmlns:a="http://schemas.openxmlformats.org/drawingml/2006/main" noChangeAspect="1"/>
             </wp:cNvGraphicFramePr>
@@ -4240,11 +4297,70 @@
               <a:graphicData uri="http://schemas.openxmlformats.org/drawingml/2006/picture">
                 <pic:pic xmlns:pic="http://schemas.openxmlformats.org/drawingml/2006/picture">
                   <pic:nvPicPr>
-                    <pic:cNvPr id="2079656963" name=""/>
+                    <pic:cNvPr id="442061809" name=""/>
                     <pic:cNvPicPr/>
                   </pic:nvPicPr>
                   <pic:blipFill>
-                    <a:blip r:embed="rId15" cstate="print">
+                    <a:blip r:embed="rId15"/>
+                    <a:stretch>
+                      <a:fillRect/>
+                    </a:stretch>
+                  </pic:blipFill>
+                  <pic:spPr>
+                    <a:xfrm>
+                      <a:off x="0" y="0"/>
+                      <a:ext cx="4980189" cy="3603939"/>
+                    </a:xfrm>
+                    <a:prstGeom prst="rect">
+                      <a:avLst/>
+                    </a:prstGeom>
+                  </pic:spPr>
+                </pic:pic>
+              </a:graphicData>
+            </a:graphic>
+          </wp:inline>
+        </w:drawing>
+      </w:r>
+    </w:p>
+    <w:p>
+      <w:pPr>
+        <w:jc w:val="center"/>
+        <w:rPr>
+          <w:b/>
+          <w:bCs/>
+        </w:rPr>
+      </w:pPr>
+      <w:r>
+        <w:rPr>
+          <w:rFonts w:ascii="Times New Roman" w:hAnsi="Times New Roman" w:cs="Times New Roman"/>
+          <w:noProof/>
+        </w:rPr>
+        <w:lastRenderedPageBreak/>
+        <w:drawing>
+          <wp:anchor distT="0" distB="0" distL="114300" distR="114300" simplePos="0" relativeHeight="251666432" behindDoc="0" locked="0" layoutInCell="1" allowOverlap="1" wp14:anchorId="24A0C30E" wp14:editId="6921FFBC">
+            <wp:simplePos x="0" y="0"/>
+            <wp:positionH relativeFrom="page">
+              <wp:align>right</wp:align>
+            </wp:positionH>
+            <wp:positionV relativeFrom="paragraph">
+              <wp:posOffset>3432810</wp:posOffset>
+            </wp:positionV>
+            <wp:extent cx="7550150" cy="2470150"/>
+            <wp:effectExtent l="0" t="0" r="0" b="6350"/>
+            <wp:wrapTopAndBottom/>
+            <wp:docPr id="516236200" name="Picture 1"/>
+            <wp:cNvGraphicFramePr>
+              <a:graphicFrameLocks xmlns:a="http://schemas.openxmlformats.org/drawingml/2006/main" noChangeAspect="1"/>
+            </wp:cNvGraphicFramePr>
+            <a:graphic xmlns:a="http://schemas.openxmlformats.org/drawingml/2006/main">
+              <a:graphicData uri="http://schemas.openxmlformats.org/drawingml/2006/picture">
+                <pic:pic xmlns:pic="http://schemas.openxmlformats.org/drawingml/2006/picture">
+                  <pic:nvPicPr>
+                    <pic:cNvPr id="516236200" name="Picture 516236200"/>
+                    <pic:cNvPicPr/>
+                  </pic:nvPicPr>
+                  <pic:blipFill>
+                    <a:blip r:embed="rId16" cstate="print">
                       <a:extLst>
                         <a:ext uri="{28A0092B-C50C-407E-A947-70E740481C1C}">
                           <a14:useLocalDpi xmlns:a14="http://schemas.microsoft.com/office/drawing/2010/main" val="0"/>
@@ -4258,7 +4374,7 @@
                   <pic:spPr>
                     <a:xfrm>
                       <a:off x="0" y="0"/>
-                      <a:ext cx="2269490" cy="1539240"/>
+                      <a:ext cx="7550150" cy="2470150"/>
                     </a:xfrm>
                     <a:prstGeom prst="rect">
                       <a:avLst/>
@@ -4282,10 +4398,10 @@
           <w:noProof/>
         </w:rPr>
         <w:drawing>
-          <wp:inline distT="0" distB="0" distL="0" distR="0" wp14:anchorId="6C284C79" wp14:editId="2FD96F82">
-            <wp:extent cx="2179320" cy="1577076"/>
-            <wp:effectExtent l="0" t="0" r="0" b="4445"/>
-            <wp:docPr id="1572578045" name="Picture 1"/>
+          <wp:inline distT="0" distB="0" distL="0" distR="0" wp14:anchorId="16CCDAE9" wp14:editId="3CA5880C">
+            <wp:extent cx="4745620" cy="3217806"/>
+            <wp:effectExtent l="0" t="0" r="0" b="1905"/>
+            <wp:docPr id="2079656963" name="Picture 1"/>
             <wp:cNvGraphicFramePr>
               <a:graphicFrameLocks xmlns:a="http://schemas.openxmlformats.org/drawingml/2006/main" noChangeAspect="1"/>
             </wp:cNvGraphicFramePr>
@@ -4293,65 +4409,7 @@
               <a:graphicData uri="http://schemas.openxmlformats.org/drawingml/2006/picture">
                 <pic:pic xmlns:pic="http://schemas.openxmlformats.org/drawingml/2006/picture">
                   <pic:nvPicPr>
-                    <pic:cNvPr id="442061809" name=""/>
-                    <pic:cNvPicPr/>
-                  </pic:nvPicPr>
-                  <pic:blipFill>
-                    <a:blip r:embed="rId16"/>
-                    <a:stretch>
-                      <a:fillRect/>
-                    </a:stretch>
-                  </pic:blipFill>
-                  <pic:spPr>
-                    <a:xfrm>
-                      <a:off x="0" y="0"/>
-                      <a:ext cx="2200191" cy="1592180"/>
-                    </a:xfrm>
-                    <a:prstGeom prst="rect">
-                      <a:avLst/>
-                    </a:prstGeom>
-                  </pic:spPr>
-                </pic:pic>
-              </a:graphicData>
-            </a:graphic>
-          </wp:inline>
-        </w:drawing>
-      </w:r>
-    </w:p>
-    <w:p>
-      <w:pPr>
-        <w:ind w:left="360" w:firstLine="0"/>
-        <w:rPr>
-          <w:rFonts w:ascii="Times New Roman" w:hAnsi="Times New Roman" w:cs="Times New Roman"/>
-        </w:rPr>
-      </w:pPr>
-      <w:r>
-        <w:rPr>
-          <w:rFonts w:ascii="Times New Roman" w:hAnsi="Times New Roman" w:cs="Times New Roman"/>
-          <w:noProof/>
-        </w:rPr>
-        <w:lastRenderedPageBreak/>
-        <w:drawing>
-          <wp:anchor distT="0" distB="0" distL="114300" distR="114300" simplePos="0" relativeHeight="251666432" behindDoc="0" locked="0" layoutInCell="1" allowOverlap="1" wp14:anchorId="24A0C30E" wp14:editId="6EAA7CC0">
-            <wp:simplePos x="0" y="0"/>
-            <wp:positionH relativeFrom="page">
-              <wp:align>left</wp:align>
-            </wp:positionH>
-            <wp:positionV relativeFrom="paragraph">
-              <wp:posOffset>194</wp:posOffset>
-            </wp:positionV>
-            <wp:extent cx="7579074" cy="2463178"/>
-            <wp:effectExtent l="0" t="0" r="3175" b="0"/>
-            <wp:wrapTopAndBottom/>
-            <wp:docPr id="516236200" name="Picture 1"/>
-            <wp:cNvGraphicFramePr>
-              <a:graphicFrameLocks xmlns:a="http://schemas.openxmlformats.org/drawingml/2006/main" noChangeAspect="1"/>
-            </wp:cNvGraphicFramePr>
-            <a:graphic xmlns:a="http://schemas.openxmlformats.org/drawingml/2006/main">
-              <a:graphicData uri="http://schemas.openxmlformats.org/drawingml/2006/picture">
-                <pic:pic xmlns:pic="http://schemas.openxmlformats.org/drawingml/2006/picture">
-                  <pic:nvPicPr>
-                    <pic:cNvPr id="516236200" name="Picture 516236200"/>
+                    <pic:cNvPr id="2079656963" name=""/>
                     <pic:cNvPicPr/>
                   </pic:nvPicPr>
                   <pic:blipFill>
@@ -4369,7 +4427,7 @@
                   <pic:spPr>
                     <a:xfrm>
                       <a:off x="0" y="0"/>
-                      <a:ext cx="7579074" cy="2463178"/>
+                      <a:ext cx="4755245" cy="3224333"/>
                     </a:xfrm>
                     <a:prstGeom prst="rect">
                       <a:avLst/>
@@ -4378,15 +4436,18 @@
                 </pic:pic>
               </a:graphicData>
             </a:graphic>
-            <wp14:sizeRelH relativeFrom="margin">
-              <wp14:pctWidth>0</wp14:pctWidth>
-            </wp14:sizeRelH>
-            <wp14:sizeRelV relativeFrom="margin">
-              <wp14:pctHeight>0</wp14:pctHeight>
-            </wp14:sizeRelV>
-          </wp:anchor>
+          </wp:inline>
         </w:drawing>
       </w:r>
+    </w:p>
+    <w:p>
+      <w:pPr>
+        <w:ind w:firstLine="0"/>
+        <w:rPr>
+          <w:rFonts w:ascii="Times New Roman" w:hAnsi="Times New Roman" w:cs="Times New Roman"/>
+          <w:lang w:val="vi-VN"/>
+        </w:rPr>
+      </w:pPr>
     </w:p>
     <w:p>
       <w:pPr>
@@ -4399,10 +4460,15 @@
           <w:color w:val="auto"/>
           <w:sz w:val="36"/>
           <w:szCs w:val="36"/>
+          <w:lang w:val="vi-VN"/>
         </w:rPr>
       </w:pPr>
       <w:bookmarkStart w:id="14" w:name="_Toc229416411"/>
-      <w:r>
+    </w:p>
+    <w:p>
+      <w:pPr>
+        <w:pStyle w:val="Heading1"/>
+        <w:ind w:firstLine="0"/>
         <w:rPr>
           <w:rFonts w:ascii="Times New Roman" w:hAnsi="Times New Roman" w:cs="Times New Roman"/>
           <w:b/>
@@ -4410,9 +4476,9 @@
           <w:color w:val="auto"/>
           <w:sz w:val="36"/>
           <w:szCs w:val="36"/>
-        </w:rPr>
-        <w:t>9</w:t>
-      </w:r>
+          <w:lang w:val="vi-VN"/>
+        </w:rPr>
+      </w:pPr>
       <w:r>
         <w:rPr>
           <w:rFonts w:ascii="Times New Roman" w:hAnsi="Times New Roman" w:cs="Times New Roman"/>
@@ -4421,6 +4487,19 @@
           <w:color w:val="auto"/>
           <w:sz w:val="36"/>
           <w:szCs w:val="36"/>
+          <w:lang w:val="vi-VN"/>
+        </w:rPr>
+        <w:t>10</w:t>
+      </w:r>
+      <w:r>
+        <w:rPr>
+          <w:rFonts w:ascii="Times New Roman" w:hAnsi="Times New Roman" w:cs="Times New Roman"/>
+          <w:b/>
+          <w:bCs/>
+          <w:color w:val="auto"/>
+          <w:sz w:val="36"/>
+          <w:szCs w:val="36"/>
+          <w:lang w:val="vi-VN"/>
         </w:rPr>
         <w:t>. THIẾT KẾ CÁC TRẠNG THÁI THỰC NGHIỆM</w:t>
       </w:r>
@@ -4428,158 +4507,192 @@
     </w:p>
     <w:p>
       <w:pPr>
-        <w:rPr>
-          <w:rFonts w:ascii="Times New Roman" w:hAnsi="Times New Roman" w:cs="Times New Roman"/>
-        </w:rPr>
-      </w:pPr>
-      <w:r>
-        <w:rPr>
-          <w:rFonts w:ascii="Times New Roman" w:hAnsi="Times New Roman" w:cs="Times New Roman"/>
+        <w:jc w:val="both"/>
+        <w:rPr>
+          <w:rFonts w:ascii="Times New Roman" w:hAnsi="Times New Roman" w:cs="Times New Roman"/>
+          <w:lang w:val="vi-VN"/>
+        </w:rPr>
+      </w:pPr>
+      <w:r>
+        <w:rPr>
+          <w:rFonts w:ascii="Times New Roman" w:hAnsi="Times New Roman" w:cs="Times New Roman"/>
+          <w:lang w:val="vi-VN"/>
         </w:rPr>
         <w:t>Mô tả sơ bộ các trạng thái thực nghiệm:</w:t>
       </w:r>
     </w:p>
     <w:p>
       <w:pPr>
-        <w:rPr>
-          <w:rFonts w:ascii="Times New Roman" w:hAnsi="Times New Roman" w:cs="Times New Roman"/>
-        </w:rPr>
-      </w:pPr>
-      <w:r>
-        <w:rPr>
-          <w:rFonts w:ascii="Times New Roman" w:hAnsi="Times New Roman" w:cs="Times New Roman"/>
+        <w:jc w:val="both"/>
+        <w:rPr>
+          <w:rFonts w:ascii="Times New Roman" w:hAnsi="Times New Roman" w:cs="Times New Roman"/>
+          <w:lang w:val="vi-VN"/>
+        </w:rPr>
+      </w:pPr>
+      <w:r>
+        <w:rPr>
+          <w:rFonts w:ascii="Times New Roman" w:hAnsi="Times New Roman" w:cs="Times New Roman"/>
+          <w:lang w:val="vi-VN"/>
         </w:rPr>
         <w:t xml:space="preserve">Phần này trình bày </w:t>
       </w:r>
       <w:r>
         <w:rPr>
           <w:rFonts w:ascii="Times New Roman" w:hAnsi="Times New Roman" w:cs="Times New Roman"/>
+          <w:lang w:val="vi-VN"/>
         </w:rPr>
         <w:t>6</w:t>
       </w:r>
       <w:r>
         <w:rPr>
           <w:rFonts w:ascii="Times New Roman" w:hAnsi="Times New Roman" w:cs="Times New Roman"/>
+          <w:lang w:val="vi-VN"/>
         </w:rPr>
         <w:t xml:space="preserve"> trạng thái, trong đó , mỗi trạng thái được biểu thị kết quả dưới dạng bảng được xuất ra </w:t>
       </w:r>
       <w:r>
         <w:rPr>
           <w:rFonts w:ascii="Times New Roman" w:hAnsi="Times New Roman" w:cs="Times New Roman"/>
+          <w:lang w:val="vi-VN"/>
         </w:rPr>
         <w:t>ở bảng Log phía dưới bàn cờ. Tuy nhiên, để đảm bảo tính ổn định về mặt thời gian, có một giới hạn về thời gian phản hồi</w:t>
       </w:r>
       <w:r>
         <w:rPr>
           <w:rFonts w:ascii="Times New Roman" w:hAnsi="Times New Roman" w:cs="Times New Roman"/>
+          <w:lang w:val="vi-VN"/>
         </w:rPr>
         <w:t>. Nếu quá 5s mà máy chưa thể tìm được nước đi tối ưu nhất, máy sẽ trả về nước đi tốt nhất mà máy tìm được trong 5s đó</w:t>
       </w:r>
       <w:r>
         <w:rPr>
           <w:rFonts w:ascii="Times New Roman" w:hAnsi="Times New Roman" w:cs="Times New Roman"/>
+          <w:lang w:val="vi-VN"/>
         </w:rPr>
         <w:t>(kết quả này được bôi đỏ)</w:t>
       </w:r>
       <w:r>
         <w:rPr>
           <w:rFonts w:ascii="Times New Roman" w:hAnsi="Times New Roman" w:cs="Times New Roman"/>
+          <w:lang w:val="vi-VN"/>
         </w:rPr>
         <w:t xml:space="preserve">. Ngoài ra, vì ở độ sâu 4, Minimax có lượng </w:t>
       </w:r>
       <w:r>
         <w:rPr>
           <w:rFonts w:ascii="Times New Roman" w:hAnsi="Times New Roman" w:cs="Times New Roman"/>
+          <w:lang w:val="vi-VN"/>
         </w:rPr>
         <w:t>phần tử phải duyệt quá lớn, nên sẽ không xét để tránh tình trạng treo máy.</w:t>
       </w:r>
     </w:p>
     <w:p>
       <w:pPr>
-        <w:rPr>
-          <w:rFonts w:ascii="Times New Roman" w:hAnsi="Times New Roman" w:cs="Times New Roman"/>
-        </w:rPr>
-      </w:pPr>
-      <w:r>
-        <w:rPr>
-          <w:rFonts w:ascii="Times New Roman" w:hAnsi="Times New Roman" w:cs="Times New Roman"/>
+        <w:jc w:val="both"/>
+        <w:rPr>
+          <w:rFonts w:ascii="Times New Roman" w:hAnsi="Times New Roman" w:cs="Times New Roman"/>
+          <w:lang w:val="vi-VN"/>
+        </w:rPr>
+      </w:pPr>
+      <w:r>
+        <w:rPr>
+          <w:rFonts w:ascii="Times New Roman" w:hAnsi="Times New Roman" w:cs="Times New Roman"/>
+          <w:lang w:val="vi-VN"/>
         </w:rPr>
         <w:t>Hình 1: Bàn cờ đang ở giai đoạn đầu, chỉ có 4 quân cờ đã được đánh.</w:t>
       </w:r>
     </w:p>
     <w:p>
       <w:pPr>
-        <w:rPr>
-          <w:rFonts w:ascii="Times New Roman" w:hAnsi="Times New Roman" w:cs="Times New Roman"/>
-        </w:rPr>
-      </w:pPr>
-      <w:r>
-        <w:rPr>
-          <w:rFonts w:ascii="Times New Roman" w:hAnsi="Times New Roman" w:cs="Times New Roman"/>
-        </w:rPr>
+        <w:jc w:val="both"/>
+        <w:rPr>
+          <w:rFonts w:ascii="Times New Roman" w:hAnsi="Times New Roman" w:cs="Times New Roman"/>
+          <w:lang w:val="vi-VN"/>
+        </w:rPr>
+      </w:pPr>
+      <w:r>
+        <w:rPr>
+          <w:rFonts w:ascii="Times New Roman" w:hAnsi="Times New Roman" w:cs="Times New Roman"/>
+          <w:lang w:val="vi-VN"/>
+        </w:rPr>
+        <w:lastRenderedPageBreak/>
         <w:t xml:space="preserve">Hình 2: Người chơi đã tạo được chuỗi 3 </w:t>
       </w:r>
       <w:r>
         <w:rPr>
           <w:rFonts w:ascii="Times New Roman" w:hAnsi="Times New Roman" w:cs="Times New Roman"/>
+          <w:lang w:val="vi-VN"/>
         </w:rPr>
         <w:t>quân X liên tiếp, máy buộc phải ra quyết định chặn.</w:t>
       </w:r>
     </w:p>
     <w:p>
       <w:pPr>
-        <w:rPr>
-          <w:rFonts w:ascii="Times New Roman" w:hAnsi="Times New Roman" w:cs="Times New Roman"/>
-        </w:rPr>
-      </w:pPr>
-      <w:r>
-        <w:rPr>
-          <w:rFonts w:ascii="Times New Roman" w:hAnsi="Times New Roman" w:cs="Times New Roman"/>
+        <w:jc w:val="both"/>
+        <w:rPr>
+          <w:rFonts w:ascii="Times New Roman" w:hAnsi="Times New Roman" w:cs="Times New Roman"/>
+          <w:lang w:val="vi-VN"/>
+        </w:rPr>
+      </w:pPr>
+      <w:r>
+        <w:rPr>
+          <w:rFonts w:ascii="Times New Roman" w:hAnsi="Times New Roman" w:cs="Times New Roman"/>
+          <w:lang w:val="vi-VN"/>
         </w:rPr>
         <w:t xml:space="preserve">Hình 3: </w:t>
       </w:r>
       <w:r>
         <w:rPr>
           <w:rFonts w:ascii="Times New Roman" w:hAnsi="Times New Roman" w:cs="Times New Roman"/>
+          <w:lang w:val="vi-VN"/>
         </w:rPr>
         <w:t>Máy và người đều tạo được chuỗi 3 quân liên tiếp, máy phải đưa ra quyết định tấn công hoặc phòng thủ</w:t>
       </w:r>
     </w:p>
     <w:p>
       <w:pPr>
-        <w:rPr>
-          <w:rFonts w:ascii="Times New Roman" w:hAnsi="Times New Roman" w:cs="Times New Roman"/>
-        </w:rPr>
-      </w:pPr>
-      <w:r>
-        <w:rPr>
-          <w:rFonts w:ascii="Times New Roman" w:hAnsi="Times New Roman" w:cs="Times New Roman"/>
+        <w:jc w:val="both"/>
+        <w:rPr>
+          <w:rFonts w:ascii="Times New Roman" w:hAnsi="Times New Roman" w:cs="Times New Roman"/>
+          <w:lang w:val="vi-VN"/>
+        </w:rPr>
+      </w:pPr>
+      <w:r>
+        <w:rPr>
+          <w:rFonts w:ascii="Times New Roman" w:hAnsi="Times New Roman" w:cs="Times New Roman"/>
+          <w:lang w:val="vi-VN"/>
         </w:rPr>
         <w:t>Hình 4: Máy đã tạo được chuỗi 3 quân O liên tiếp nhưng người “ngây thơ”</w:t>
       </w:r>
     </w:p>
     <w:p>
       <w:pPr>
-        <w:rPr>
-          <w:rFonts w:ascii="Times New Roman" w:hAnsi="Times New Roman" w:cs="Times New Roman"/>
-        </w:rPr>
-      </w:pPr>
-      <w:r>
-        <w:rPr>
-          <w:rFonts w:ascii="Times New Roman" w:hAnsi="Times New Roman" w:cs="Times New Roman"/>
+        <w:jc w:val="both"/>
+        <w:rPr>
+          <w:rFonts w:ascii="Times New Roman" w:hAnsi="Times New Roman" w:cs="Times New Roman"/>
+          <w:lang w:val="vi-VN"/>
+        </w:rPr>
+      </w:pPr>
+      <w:r>
+        <w:rPr>
+          <w:rFonts w:ascii="Times New Roman" w:hAnsi="Times New Roman" w:cs="Times New Roman"/>
+          <w:lang w:val="vi-VN"/>
         </w:rPr>
         <w:t>Hình 5: Máy liên tục phải chặn những chuỗi 3 của người chơi</w:t>
       </w:r>
     </w:p>
     <w:p>
       <w:pPr>
-        <w:rPr>
-          <w:rFonts w:ascii="Times New Roman" w:hAnsi="Times New Roman" w:cs="Times New Roman"/>
-        </w:rPr>
-      </w:pPr>
-      <w:r>
-        <w:rPr>
-          <w:rFonts w:ascii="Times New Roman" w:hAnsi="Times New Roman" w:cs="Times New Roman"/>
+        <w:jc w:val="both"/>
+        <w:rPr>
+          <w:rFonts w:ascii="Times New Roman" w:hAnsi="Times New Roman" w:cs="Times New Roman"/>
+          <w:lang w:val="vi-VN"/>
+        </w:rPr>
+      </w:pPr>
+      <w:r>
+        <w:rPr>
+          <w:rFonts w:ascii="Times New Roman" w:hAnsi="Times New Roman" w:cs="Times New Roman"/>
+          <w:lang w:val="vi-VN"/>
         </w:rPr>
         <w:t>Hình 6: Người đã có chuỗi 3 X nhưng máy lại không đưa ra quyết định chặn</w:t>
       </w:r>
@@ -4589,6 +4702,7 @@
         <w:ind w:firstLine="0"/>
         <w:rPr>
           <w:rFonts w:ascii="Times New Roman" w:hAnsi="Times New Roman" w:cs="Times New Roman"/>
+          <w:lang w:val="vi-VN"/>
         </w:rPr>
       </w:pPr>
       <w:r>
@@ -4596,9 +4710,8 @@
           <w:rFonts w:ascii="Times New Roman" w:hAnsi="Times New Roman" w:cs="Times New Roman"/>
           <w:noProof/>
         </w:rPr>
-        <w:lastRenderedPageBreak/>
         <w:drawing>
-          <wp:anchor distT="0" distB="0" distL="114300" distR="114300" simplePos="0" relativeHeight="251658240" behindDoc="0" locked="0" layoutInCell="1" allowOverlap="1" wp14:anchorId="2B03BE79" wp14:editId="3B2C91A3">
+          <wp:anchor distT="0" distB="0" distL="114300" distR="114300" simplePos="0" relativeHeight="251658240" behindDoc="0" locked="0" layoutInCell="1" allowOverlap="1" wp14:anchorId="2B03BE79" wp14:editId="20253EE1">
             <wp:simplePos x="0" y="0"/>
             <wp:positionH relativeFrom="column">
               <wp:posOffset>2895600</wp:posOffset>
@@ -4698,6 +4811,7 @@
         <w:rPr>
           <w:rFonts w:ascii="Times New Roman" w:hAnsi="Times New Roman" w:cs="Times New Roman"/>
           <w:noProof/>
+          <w:lang w:val="vi-VN"/>
         </w:rPr>
         <w:t xml:space="preserve"> </w:t>
       </w:r>
@@ -4707,6 +4821,7 @@
         <w:ind w:firstLine="0"/>
         <w:rPr>
           <w:rFonts w:ascii="Times New Roman" w:hAnsi="Times New Roman" w:cs="Times New Roman"/>
+          <w:lang w:val="vi-VN"/>
         </w:rPr>
       </w:pPr>
       <w:r>
@@ -4715,16 +4830,16 @@
           <w:noProof/>
         </w:rPr>
         <w:drawing>
-          <wp:anchor distT="0" distB="0" distL="114300" distR="114300" simplePos="0" relativeHeight="251659264" behindDoc="0" locked="0" layoutInCell="1" allowOverlap="1" wp14:anchorId="4635C9B1" wp14:editId="404F3EE4">
+          <wp:anchor distT="0" distB="0" distL="114300" distR="114300" simplePos="0" relativeHeight="251659264" behindDoc="0" locked="0" layoutInCell="1" allowOverlap="1" wp14:anchorId="4635C9B1" wp14:editId="3D9F379C">
             <wp:simplePos x="0" y="0"/>
             <wp:positionH relativeFrom="column">
-              <wp:posOffset>3013710</wp:posOffset>
+              <wp:posOffset>2912745</wp:posOffset>
             </wp:positionH>
             <wp:positionV relativeFrom="paragraph">
               <wp:posOffset>297815</wp:posOffset>
             </wp:positionV>
-            <wp:extent cx="2651125" cy="3330575"/>
-            <wp:effectExtent l="0" t="0" r="0" b="3175"/>
+            <wp:extent cx="2748915" cy="3379470"/>
+            <wp:effectExtent l="0" t="0" r="0" b="0"/>
             <wp:wrapSquare wrapText="bothSides"/>
             <wp:docPr id="1435072577" name="Picture 1"/>
             <wp:cNvGraphicFramePr>
@@ -4752,7 +4867,7 @@
                   <pic:spPr>
                     <a:xfrm>
                       <a:off x="0" y="0"/>
-                      <a:ext cx="2651125" cy="3330575"/>
+                      <a:ext cx="2748915" cy="3379470"/>
                     </a:xfrm>
                     <a:prstGeom prst="rect">
                       <a:avLst/>
@@ -4776,16 +4891,16 @@
           <w:noProof/>
         </w:rPr>
         <w:drawing>
-          <wp:anchor distT="0" distB="0" distL="114300" distR="114300" simplePos="0" relativeHeight="251662336" behindDoc="0" locked="0" layoutInCell="1" allowOverlap="1" wp14:anchorId="5E56B69E" wp14:editId="404C0B03">
+          <wp:anchor distT="0" distB="0" distL="114300" distR="114300" simplePos="0" relativeHeight="251662336" behindDoc="0" locked="0" layoutInCell="1" allowOverlap="1" wp14:anchorId="5E56B69E" wp14:editId="5E8208FA">
             <wp:simplePos x="0" y="0"/>
-            <wp:positionH relativeFrom="column">
-              <wp:posOffset>-69215</wp:posOffset>
+            <wp:positionH relativeFrom="margin">
+              <wp:align>left</wp:align>
             </wp:positionH>
             <wp:positionV relativeFrom="paragraph">
-              <wp:posOffset>304800</wp:posOffset>
+              <wp:posOffset>349828</wp:posOffset>
             </wp:positionV>
-            <wp:extent cx="2680335" cy="3314700"/>
-            <wp:effectExtent l="0" t="0" r="5715" b="0"/>
+            <wp:extent cx="2771140" cy="3314700"/>
+            <wp:effectExtent l="0" t="0" r="0" b="0"/>
             <wp:wrapSquare wrapText="bothSides"/>
             <wp:docPr id="776144907" name="Picture 1"/>
             <wp:cNvGraphicFramePr>
@@ -4813,7 +4928,7 @@
                   <pic:spPr>
                     <a:xfrm>
                       <a:off x="0" y="0"/>
-                      <a:ext cx="2680335" cy="3314700"/>
+                      <a:ext cx="2771140" cy="3314700"/>
                     </a:xfrm>
                     <a:prstGeom prst="rect">
                       <a:avLst/>
@@ -4834,30 +4949,49 @@
       <w:r>
         <w:rPr>
           <w:rFonts w:ascii="Times New Roman" w:hAnsi="Times New Roman" w:cs="Times New Roman"/>
+          <w:lang w:val="vi-VN"/>
         </w:rPr>
         <w:t xml:space="preserve">               Hình 1</w:t>
       </w:r>
       <w:r>
         <w:rPr>
           <w:rFonts w:ascii="Times New Roman" w:hAnsi="Times New Roman" w:cs="Times New Roman"/>
+          <w:lang w:val="vi-VN"/>
         </w:rPr>
         <w:t>: Trạng thái khởi đầu</w:t>
       </w:r>
       <w:r>
         <w:rPr>
           <w:rFonts w:ascii="Times New Roman" w:hAnsi="Times New Roman" w:cs="Times New Roman"/>
-        </w:rPr>
-        <w:t xml:space="preserve">                         Hình 2</w:t>
-      </w:r>
-      <w:r>
-        <w:rPr>
-          <w:rFonts w:ascii="Times New Roman" w:hAnsi="Times New Roman" w:cs="Times New Roman"/>
+          <w:lang w:val="vi-VN"/>
+        </w:rPr>
+        <w:t xml:space="preserve">                   </w:t>
+      </w:r>
+      <w:r>
+        <w:rPr>
+          <w:rFonts w:ascii="Times New Roman" w:hAnsi="Times New Roman" w:cs="Times New Roman"/>
+          <w:lang w:val="vi-VN"/>
+        </w:rPr>
+        <w:t xml:space="preserve"> </w:t>
+      </w:r>
+      <w:r>
+        <w:rPr>
+          <w:rFonts w:ascii="Times New Roman" w:hAnsi="Times New Roman" w:cs="Times New Roman"/>
+          <w:lang w:val="vi-VN"/>
+        </w:rPr>
+        <w:t>Hình 2</w:t>
+      </w:r>
+      <w:r>
+        <w:rPr>
+          <w:rFonts w:ascii="Times New Roman" w:hAnsi="Times New Roman" w:cs="Times New Roman"/>
+          <w:lang w:val="vi-VN"/>
         </w:rPr>
         <w:t xml:space="preserve">: Trạng thái </w:t>
       </w:r>
       <w:r>
         <w:rPr>
           <w:rFonts w:ascii="Times New Roman" w:hAnsi="Times New Roman" w:cs="Times New Roman"/>
+          <w:lang w:val="vi-VN"/>
         </w:rPr>
         <w:t>người chơi sắp thắng</w:t>
       </w:r>
@@ -4868,81 +5002,102 @@
         <w:rPr>
           <w:rFonts w:ascii="Times New Roman" w:hAnsi="Times New Roman" w:cs="Times New Roman"/>
           <w:noProof/>
+          <w:lang w:val="vi-VN"/>
         </w:rPr>
       </w:pPr>
       <w:r>
         <w:rPr>
           <w:rFonts w:ascii="Times New Roman" w:hAnsi="Times New Roman" w:cs="Times New Roman"/>
           <w:noProof/>
-        </w:rPr>
+          <w:lang w:val="vi-VN"/>
+        </w:rPr>
+        <w:lastRenderedPageBreak/>
         <w:t xml:space="preserve"> </w:t>
       </w:r>
       <w:r>
         <w:rPr>
           <w:rFonts w:ascii="Times New Roman" w:hAnsi="Times New Roman" w:cs="Times New Roman"/>
           <w:noProof/>
+          <w:lang w:val="vi-VN"/>
         </w:rPr>
         <w:t xml:space="preserve">        </w:t>
       </w:r>
     </w:p>
     <w:p>
       <w:pPr>
-        <w:ind w:firstLine="0"/>
-        <w:rPr>
-          <w:rFonts w:ascii="Times New Roman" w:hAnsi="Times New Roman" w:cs="Times New Roman"/>
-        </w:rPr>
-      </w:pPr>
-      <w:r>
-        <w:rPr>
-          <w:rFonts w:ascii="Times New Roman" w:hAnsi="Times New Roman" w:cs="Times New Roman"/>
+        <w:ind w:right="-709" w:firstLine="0"/>
+        <w:rPr>
+          <w:rFonts w:ascii="Times New Roman" w:hAnsi="Times New Roman" w:cs="Times New Roman"/>
+          <w:lang w:val="vi-VN"/>
+        </w:rPr>
+      </w:pPr>
+      <w:r>
+        <w:rPr>
+          <w:rFonts w:ascii="Times New Roman" w:hAnsi="Times New Roman" w:cs="Times New Roman"/>
+          <w:lang w:val="vi-VN"/>
         </w:rPr>
         <w:t>Hình 3:</w:t>
       </w:r>
       <w:r>
         <w:rPr>
           <w:rFonts w:ascii="Times New Roman" w:hAnsi="Times New Roman" w:cs="Times New Roman"/>
+          <w:lang w:val="vi-VN"/>
         </w:rPr>
         <w:t xml:space="preserve"> Máy </w:t>
       </w:r>
       <w:r>
         <w:rPr>
           <w:rFonts w:ascii="Times New Roman" w:hAnsi="Times New Roman" w:cs="Times New Roman"/>
+          <w:lang w:val="vi-VN"/>
         </w:rPr>
         <w:t>quyết định thắng hoặc chặn</w:t>
       </w:r>
       <w:r>
         <w:rPr>
           <w:rFonts w:ascii="Times New Roman" w:hAnsi="Times New Roman" w:cs="Times New Roman"/>
+          <w:lang w:val="vi-VN"/>
         </w:rPr>
         <w:t xml:space="preserve"> </w:t>
       </w:r>
       <w:r>
         <w:rPr>
           <w:rFonts w:ascii="Times New Roman" w:hAnsi="Times New Roman" w:cs="Times New Roman"/>
+          <w:lang w:val="vi-VN"/>
         </w:rPr>
         <w:t xml:space="preserve">   </w:t>
       </w:r>
       <w:r>
         <w:rPr>
           <w:rFonts w:ascii="Times New Roman" w:hAnsi="Times New Roman" w:cs="Times New Roman"/>
+          <w:lang w:val="vi-VN"/>
         </w:rPr>
         <w:t xml:space="preserve">  </w:t>
       </w:r>
       <w:r>
         <w:rPr>
           <w:rFonts w:ascii="Times New Roman" w:hAnsi="Times New Roman" w:cs="Times New Roman"/>
+          <w:lang w:val="vi-VN"/>
+        </w:rPr>
+        <w:t xml:space="preserve">       </w:t>
+      </w:r>
+      <w:r>
+        <w:rPr>
+          <w:rFonts w:ascii="Times New Roman" w:hAnsi="Times New Roman" w:cs="Times New Roman"/>
+          <w:lang w:val="vi-VN"/>
         </w:rPr>
         <w:t>Hình 4:</w:t>
       </w:r>
       <w:r>
         <w:rPr>
           <w:rFonts w:ascii="Times New Roman" w:hAnsi="Times New Roman" w:cs="Times New Roman"/>
+          <w:lang w:val="vi-VN"/>
         </w:rPr>
         <w:t xml:space="preserve"> </w:t>
       </w:r>
       <w:r>
         <w:rPr>
           <w:rFonts w:ascii="Times New Roman" w:hAnsi="Times New Roman" w:cs="Times New Roman"/>
+          <w:lang w:val="vi-VN"/>
         </w:rPr>
         <w:t>Người “ ngây thơ”, máy dễ dàng thắng</w:t>
       </w:r>
@@ -4952,6 +5107,7 @@
         <w:ind w:firstLine="0"/>
         <w:rPr>
           <w:rFonts w:ascii="Times New Roman" w:hAnsi="Times New Roman" w:cs="Times New Roman"/>
+          <w:lang w:val="vi-VN"/>
         </w:rPr>
       </w:pPr>
       <w:r>
@@ -4959,9 +5115,8 @@
           <w:rFonts w:ascii="Times New Roman" w:hAnsi="Times New Roman" w:cs="Times New Roman"/>
           <w:noProof/>
         </w:rPr>
-        <w:lastRenderedPageBreak/>
         <w:drawing>
-          <wp:anchor distT="0" distB="0" distL="114300" distR="114300" simplePos="0" relativeHeight="251663360" behindDoc="0" locked="0" layoutInCell="1" allowOverlap="1" wp14:anchorId="4724130E" wp14:editId="40F2DE6E">
+          <wp:anchor distT="0" distB="0" distL="114300" distR="114300" simplePos="0" relativeHeight="251663360" behindDoc="0" locked="0" layoutInCell="1" allowOverlap="1" wp14:anchorId="4724130E" wp14:editId="0C2ABC2F">
             <wp:simplePos x="0" y="0"/>
             <wp:positionH relativeFrom="margin">
               <wp:align>right</wp:align>
@@ -4969,8 +5124,8 @@
             <wp:positionV relativeFrom="paragraph">
               <wp:posOffset>0</wp:posOffset>
             </wp:positionV>
-            <wp:extent cx="2722880" cy="3406140"/>
-            <wp:effectExtent l="0" t="0" r="1270" b="3810"/>
+            <wp:extent cx="2722880" cy="3460750"/>
+            <wp:effectExtent l="0" t="0" r="1270" b="6350"/>
             <wp:wrapSquare wrapText="bothSides"/>
             <wp:docPr id="299579717" name="Picture 1"/>
             <wp:cNvGraphicFramePr>
@@ -4998,7 +5153,7 @@
                   <pic:spPr>
                     <a:xfrm>
                       <a:off x="0" y="0"/>
-                      <a:ext cx="2722880" cy="3406140"/>
+                      <a:ext cx="2725118" cy="3463675"/>
                     </a:xfrm>
                     <a:prstGeom prst="rect">
                       <a:avLst/>
@@ -5022,7 +5177,7 @@
           <w:noProof/>
         </w:rPr>
         <w:drawing>
-          <wp:anchor distT="0" distB="0" distL="114300" distR="114300" simplePos="0" relativeHeight="251661312" behindDoc="0" locked="0" layoutInCell="1" allowOverlap="1" wp14:anchorId="3CCBE72C" wp14:editId="2FED62C5">
+          <wp:anchor distT="0" distB="0" distL="114300" distR="114300" simplePos="0" relativeHeight="251661312" behindDoc="0" locked="0" layoutInCell="1" allowOverlap="1" wp14:anchorId="3CCBE72C" wp14:editId="47E08A69">
             <wp:simplePos x="0" y="0"/>
             <wp:positionH relativeFrom="column">
               <wp:posOffset>-34290</wp:posOffset>
@@ -5074,56 +5229,86 @@
       <w:r>
         <w:rPr>
           <w:rFonts w:ascii="Times New Roman" w:hAnsi="Times New Roman" w:cs="Times New Roman"/>
+          <w:lang w:val="vi-VN"/>
         </w:rPr>
         <w:t xml:space="preserve">                 </w:t>
       </w:r>
       <w:r>
         <w:rPr>
           <w:rFonts w:ascii="Times New Roman" w:hAnsi="Times New Roman" w:cs="Times New Roman"/>
+          <w:lang w:val="vi-VN"/>
         </w:rPr>
         <w:t xml:space="preserve">        </w:t>
       </w:r>
       <w:r>
         <w:rPr>
           <w:rFonts w:ascii="Times New Roman" w:hAnsi="Times New Roman" w:cs="Times New Roman"/>
+          <w:lang w:val="vi-VN"/>
         </w:rPr>
         <w:t xml:space="preserve">            </w:t>
       </w:r>
     </w:p>
     <w:p>
       <w:pPr>
-        <w:ind w:firstLine="0"/>
-        <w:rPr>
-          <w:rFonts w:ascii="Times New Roman" w:hAnsi="Times New Roman" w:cs="Times New Roman"/>
-        </w:rPr>
-      </w:pPr>
-      <w:r>
-        <w:rPr>
-          <w:rFonts w:ascii="Times New Roman" w:hAnsi="Times New Roman" w:cs="Times New Roman"/>
+        <w:ind w:right="-284" w:firstLine="0"/>
+        <w:rPr>
+          <w:rFonts w:ascii="Times New Roman" w:hAnsi="Times New Roman" w:cs="Times New Roman"/>
+          <w:lang w:val="vi-VN"/>
+        </w:rPr>
+      </w:pPr>
+      <w:r>
+        <w:rPr>
+          <w:rFonts w:ascii="Times New Roman" w:hAnsi="Times New Roman" w:cs="Times New Roman"/>
+          <w:lang w:val="vi-VN"/>
         </w:rPr>
         <w:t>Hình 5: Trạng thái mà</w:t>
       </w:r>
       <w:r>
         <w:rPr>
           <w:rFonts w:ascii="Times New Roman" w:hAnsi="Times New Roman" w:cs="Times New Roman"/>
+          <w:lang w:val="vi-VN"/>
         </w:rPr>
         <w:t xml:space="preserve"> máy liên tục phòng thủ</w:t>
       </w:r>
       <w:r>
         <w:rPr>
           <w:rFonts w:ascii="Times New Roman" w:hAnsi="Times New Roman" w:cs="Times New Roman"/>
-        </w:rPr>
-        <w:t xml:space="preserve">      </w:t>
-      </w:r>
-      <w:r>
-        <w:rPr>
-          <w:rFonts w:ascii="Times New Roman" w:hAnsi="Times New Roman" w:cs="Times New Roman"/>
-        </w:rPr>
-        <w:t>Hình 6: Trạng thái máy bỏ qua cơ hội chặn thua</w:t>
-      </w:r>
-      <w:r>
-        <w:rPr>
-          <w:rFonts w:ascii="Times New Roman" w:hAnsi="Times New Roman" w:cs="Times New Roman"/>
+          <w:lang w:val="vi-VN"/>
+        </w:rPr>
+        <w:t xml:space="preserve">   </w:t>
+      </w:r>
+      <w:r>
+        <w:rPr>
+          <w:rFonts w:ascii="Times New Roman" w:hAnsi="Times New Roman" w:cs="Times New Roman"/>
+          <w:lang w:val="vi-VN"/>
+        </w:rPr>
+        <w:t xml:space="preserve">   </w:t>
+      </w:r>
+      <w:r>
+        <w:rPr>
+          <w:rFonts w:ascii="Times New Roman" w:hAnsi="Times New Roman" w:cs="Times New Roman"/>
+          <w:lang w:val="vi-VN"/>
+        </w:rPr>
+        <w:t>Hình 6: Trạng thái máy bỏ qua cơ hội chặn</w:t>
+      </w:r>
+      <w:r>
+        <w:rPr>
+          <w:rFonts w:ascii="Times New Roman" w:hAnsi="Times New Roman" w:cs="Times New Roman"/>
+          <w:lang w:val="vi-VN"/>
+        </w:rPr>
+        <w:t xml:space="preserve"> </w:t>
+      </w:r>
+      <w:r>
+        <w:rPr>
+          <w:rFonts w:ascii="Times New Roman" w:hAnsi="Times New Roman" w:cs="Times New Roman"/>
+          <w:lang w:val="vi-VN"/>
+        </w:rPr>
+        <w:t>thua</w:t>
+      </w:r>
+      <w:r>
+        <w:rPr>
+          <w:rFonts w:ascii="Times New Roman" w:hAnsi="Times New Roman" w:cs="Times New Roman"/>
+          <w:lang w:val="vi-VN"/>
         </w:rPr>
         <w:t xml:space="preserve">                   </w:t>
       </w:r>
@@ -5139,6 +5324,7 @@
           <w:color w:val="auto"/>
           <w:sz w:val="36"/>
           <w:szCs w:val="36"/>
+          <w:lang w:val="vi-VN"/>
         </w:rPr>
       </w:pPr>
       <w:bookmarkStart w:id="15" w:name="_Toc229416412"/>
@@ -5150,19 +5336,53 @@
           <w:color w:val="auto"/>
           <w:sz w:val="36"/>
           <w:szCs w:val="36"/>
-        </w:rPr>
-        <w:t>10. BẢNG KẾT QUẢ THỰC NGHIỆM</w:t>
+          <w:lang w:val="vi-VN"/>
+        </w:rPr>
+        <w:t>1</w:t>
+      </w:r>
+      <w:r>
+        <w:rPr>
+          <w:rFonts w:ascii="Times New Roman" w:hAnsi="Times New Roman" w:cs="Times New Roman"/>
+          <w:b/>
+          <w:bCs/>
+          <w:color w:val="auto"/>
+          <w:sz w:val="36"/>
+          <w:szCs w:val="36"/>
+        </w:rPr>
+        <w:t>1</w:t>
+      </w:r>
+      <w:r>
+        <w:rPr>
+          <w:rFonts w:ascii="Times New Roman" w:hAnsi="Times New Roman" w:cs="Times New Roman"/>
+          <w:b/>
+          <w:bCs/>
+          <w:color w:val="auto"/>
+          <w:sz w:val="36"/>
+          <w:szCs w:val="36"/>
+          <w:lang w:val="vi-VN"/>
+        </w:rPr>
+        <w:t>. BẢNG KẾT QUẢ THỰC NGHIỆM</w:t>
       </w:r>
       <w:bookmarkEnd w:id="15"/>
     </w:p>
     <w:p>
-      <w:r>
+      <w:pPr>
+        <w:jc w:val="both"/>
+        <w:rPr>
+          <w:lang w:val="vi-VN"/>
+        </w:rPr>
+      </w:pPr>
+      <w:r>
+        <w:rPr>
+          <w:lang w:val="vi-VN"/>
+        </w:rPr>
         <w:t xml:space="preserve">Khi sử dụng tính năng </w:t>
       </w:r>
       <w:r>
         <w:rPr>
           <w:i/>
           <w:iCs/>
+          <w:lang w:val="vi-VN"/>
         </w:rPr>
         <w:t>S</w:t>
       </w:r>
@@ -5170,6 +5390,7 @@
         <w:rPr>
           <w:i/>
           <w:iCs/>
+          <w:lang w:val="vi-VN"/>
         </w:rPr>
         <w:t xml:space="preserve">o </w:t>
       </w:r>
@@ -5177,6 +5398,7 @@
         <w:rPr>
           <w:i/>
           <w:iCs/>
+          <w:lang w:val="vi-VN"/>
         </w:rPr>
         <w:t>S</w:t>
       </w:r>
@@ -5184,31 +5406,68 @@
         <w:rPr>
           <w:i/>
           <w:iCs/>
+          <w:lang w:val="vi-VN"/>
         </w:rPr>
         <w:t>ánh</w:t>
       </w:r>
       <w:r>
+        <w:rPr>
+          <w:lang w:val="vi-VN"/>
+        </w:rPr>
         <w:t>,</w:t>
       </w:r>
       <w:r>
+        <w:rPr>
+          <w:lang w:val="vi-VN"/>
+        </w:rPr>
         <w:t xml:space="preserve"> t</w:t>
       </w:r>
       <w:r>
-        <w:t>ính năng này thực hiện một cuộc “thí nghiệm ngược’.</w:t>
-      </w:r>
-      <w:r>
+        <w:rPr>
+          <w:lang w:val="vi-VN"/>
+        </w:rPr>
+        <w:t>ính năng này thực hiện một cuộc “thí nghiệm ngược</w:t>
+      </w:r>
+      <w:r>
+        <w:rPr>
+          <w:lang w:val="vi-VN"/>
+        </w:rPr>
+        <w:t>”</w:t>
+      </w:r>
+      <w:r>
+        <w:rPr>
+          <w:lang w:val="vi-VN"/>
+        </w:rPr>
+        <w:t>.</w:t>
+      </w:r>
+      <w:r>
+        <w:rPr>
+          <w:lang w:val="vi-VN"/>
+        </w:rPr>
         <w:t xml:space="preserve"> AI ghi nhớ chính xác trạng thái bàn cờ trước khi đưa ra quyết định</w:t>
       </w:r>
       <w:r>
+        <w:rPr>
+          <w:lang w:val="vi-VN"/>
+        </w:rPr>
         <w:t>(vị trí nước đi được có mày xanh)</w:t>
       </w:r>
       <w:r>
+        <w:rPr>
+          <w:lang w:val="vi-VN"/>
+        </w:rPr>
         <w:t>. Đồng thời, AI phải “ suy nghĩ lại”</w:t>
       </w:r>
       <w:r>
+        <w:rPr>
+          <w:lang w:val="vi-VN"/>
+        </w:rPr>
         <w:t xml:space="preserve"> trên đúng thế cờ đó nhưng với các tham số thay đổi ( thuật toán hoặc độ sâu). Qua tính năng này, giúp ta chứng minh được 2 quy luật cốt </w:t>
       </w:r>
       <w:r>
+        <w:rPr>
+          <w:lang w:val="vi-VN"/>
+        </w:rPr>
         <w:t xml:space="preserve">lõi </w:t>
       </w:r>
     </w:p>
@@ -5219,8 +5478,15 @@
           <w:ilvl w:val="0"/>
           <w:numId w:val="48"/>
         </w:numPr>
-      </w:pPr>
-      <w:r>
+        <w:jc w:val="both"/>
+        <w:rPr>
+          <w:lang w:val="vi-VN"/>
+        </w:rPr>
+      </w:pPr>
+      <w:r>
+        <w:rPr>
+          <w:lang w:val="vi-VN"/>
+        </w:rPr>
         <w:t>Alpha_beta tối ưu hơn Minimax ( ở cùng độ sâu)</w:t>
       </w:r>
     </w:p>
@@ -5231,8 +5497,15 @@
           <w:ilvl w:val="0"/>
           <w:numId w:val="48"/>
         </w:numPr>
-      </w:pPr>
-      <w:r>
+        <w:jc w:val="both"/>
+        <w:rPr>
+          <w:lang w:val="vi-VN"/>
+        </w:rPr>
+      </w:pPr>
+      <w:r>
+        <w:rPr>
+          <w:lang w:val="vi-VN"/>
+        </w:rPr>
         <w:t>Độ sâu lớn hơn hơn cho nước đi tốt hơn ( cùng thuật toán)</w:t>
       </w:r>
     </w:p>
@@ -5240,6 +5513,7 @@
       <w:pPr>
         <w:rPr>
           <w:rFonts w:ascii="Times New Roman" w:hAnsi="Times New Roman" w:cs="Times New Roman"/>
+          <w:lang w:val="vi-VN"/>
         </w:rPr>
       </w:pPr>
     </w:p>
@@ -6460,6 +6734,7 @@
     </w:p>
     <w:p>
       <w:pPr>
+        <w:jc w:val="both"/>
         <w:rPr>
           <w:rFonts w:ascii="Times New Roman" w:hAnsi="Times New Roman" w:cs="Times New Roman"/>
           <w:i/>
@@ -6472,6 +6747,7 @@
           <w:i/>
           <w:iCs/>
         </w:rPr>
+        <w:lastRenderedPageBreak/>
         <w:t>Khi ở trạng thái ban đầu, hàm đánh giá (Heuristic) hoạt động ổn định, nên nước đi ở các cấp độ đều đồng nh</w:t>
       </w:r>
       <w:r>
@@ -6480,16 +6756,7 @@
           <w:i/>
           <w:iCs/>
         </w:rPr>
-        <w:t xml:space="preserve">ất, lúc này máy ưu tiên chiếm lĩnh vị trí trung tâm để cố gắng kiểm </w:t>
-      </w:r>
-      <w:r>
-        <w:rPr>
-          <w:rFonts w:ascii="Times New Roman" w:hAnsi="Times New Roman" w:cs="Times New Roman"/>
-          <w:i/>
-          <w:iCs/>
-        </w:rPr>
-        <w:lastRenderedPageBreak/>
-        <w:t>soát bàn cờ.</w:t>
+        <w:t>ất, lúc này máy ưu tiên chiếm lĩnh vị trí trung tâm để cố gắng kiểm soát bàn cờ.</w:t>
       </w:r>
       <w:r>
         <w:rPr>
@@ -6615,6 +6882,16 @@
         </w:rPr>
         <w:t xml:space="preserve"> khi ở độ sâu cao hơn đã có đánh giá điểm số thực tế và thận trọng hơn.</w:t>
       </w:r>
+    </w:p>
+    <w:p>
+      <w:pPr>
+        <w:jc w:val="both"/>
+        <w:rPr>
+          <w:rFonts w:ascii="Times New Roman" w:hAnsi="Times New Roman" w:cs="Times New Roman"/>
+          <w:i/>
+          <w:iCs/>
+        </w:rPr>
+      </w:pPr>
     </w:p>
     <w:tbl>
       <w:tblPr>
@@ -8073,27 +8350,30 @@
     </w:tbl>
     <w:p>
       <w:pPr>
+        <w:jc w:val="both"/>
         <w:rPr>
           <w:rFonts w:ascii="Times New Roman" w:hAnsi="Times New Roman" w:cs="Times New Roman"/>
           <w:i/>
           <w:iCs/>
         </w:rPr>
       </w:pPr>
-      <w:r>
+    </w:p>
+    <w:p>
+      <w:pPr>
+        <w:jc w:val="both"/>
         <w:rPr>
           <w:rFonts w:ascii="Times New Roman" w:hAnsi="Times New Roman" w:cs="Times New Roman"/>
           <w:i/>
           <w:iCs/>
         </w:rPr>
-        <w:t>Ở độ sâu 3, hàm đánh giá với score=-1000</w:t>
-      </w:r>
+      </w:pPr>
       <w:r>
         <w:rPr>
           <w:rFonts w:ascii="Times New Roman" w:hAnsi="Times New Roman" w:cs="Times New Roman"/>
           <w:i/>
           <w:iCs/>
         </w:rPr>
-        <w:t xml:space="preserve"> nhưng khi ở độ sâu 4, score=-999000</w:t>
+        <w:t>Ở độ sâu 3, hàm đánh giá với score=-1000</w:t>
       </w:r>
       <w:r>
         <w:rPr>
@@ -8101,7 +8381,7 @@
           <w:i/>
           <w:iCs/>
         </w:rPr>
-        <w:t xml:space="preserve"> (mức sắp thua). Điều này chứng minh rằng</w:t>
+        <w:t xml:space="preserve"> nhưng khi ở độ sâu 4, score=-999000</w:t>
       </w:r>
       <w:r>
         <w:rPr>
@@ -8109,7 +8389,7 @@
           <w:i/>
           <w:iCs/>
         </w:rPr>
-        <w:t xml:space="preserve"> với độ sâu cao hơn, máy nhận diện được mối nguy hiểm cao hơn. Tuy nhiên vì số lượng</w:t>
+        <w:t xml:space="preserve"> (mức sắp thua). Điều này chứng minh rằng</w:t>
       </w:r>
       <w:r>
         <w:rPr>
@@ -8117,8 +8397,26 @@
           <w:i/>
           <w:iCs/>
         </w:rPr>
+        <w:t xml:space="preserve"> với độ sâu cao hơn, máy nhận diện được mối nguy hiểm cao hơn. Tuy nhiên vì số lượng</w:t>
+      </w:r>
+      <w:r>
+        <w:rPr>
+          <w:rFonts w:ascii="Times New Roman" w:hAnsi="Times New Roman" w:cs="Times New Roman"/>
+          <w:i/>
+          <w:iCs/>
+        </w:rPr>
         <w:t xml:space="preserve"> nhánh phải xét quá lớn, nên có thể ở độ sâu 4 máy chưa trả về nước đi tối ưu nhất mà chỉ trả về nước đi tốt nhất máy tìm được trong 5s.</w:t>
       </w:r>
+    </w:p>
+    <w:p>
+      <w:pPr>
+        <w:jc w:val="both"/>
+        <w:rPr>
+          <w:rFonts w:ascii="Times New Roman" w:hAnsi="Times New Roman" w:cs="Times New Roman"/>
+          <w:i/>
+          <w:iCs/>
+        </w:rPr>
+      </w:pPr>
     </w:p>
     <w:tbl>
       <w:tblPr>
@@ -9485,6 +9783,15 @@
           <w:iCs/>
         </w:rPr>
       </w:pPr>
+    </w:p>
+    <w:p>
+      <w:pPr>
+        <w:rPr>
+          <w:rFonts w:ascii="Times New Roman" w:hAnsi="Times New Roman" w:cs="Times New Roman"/>
+          <w:i/>
+          <w:iCs/>
+        </w:rPr>
+      </w:pPr>
       <w:r>
         <w:rPr>
           <w:rFonts w:ascii="Times New Roman" w:hAnsi="Times New Roman" w:cs="Times New Roman"/>
@@ -9533,15 +9840,6 @@
         </w:rPr>
         <w:t>Điều này giúp hệ thống đạt hiệu suất tuyệt đối về thời gian phản hồi.</w:t>
       </w:r>
-    </w:p>
-    <w:p>
-      <w:pPr>
-        <w:rPr>
-          <w:rFonts w:ascii="Times New Roman" w:hAnsi="Times New Roman" w:cs="Times New Roman"/>
-          <w:i/>
-          <w:iCs/>
-        </w:rPr>
-      </w:pPr>
     </w:p>
     <w:tbl>
       <w:tblPr>
@@ -11135,7 +11433,7 @@
           <w:i/>
           <w:iCs/>
         </w:rPr>
-        <w:t xml:space="preserve">ời, nước đi mà AI cho là tối ưu cũng khác </w:t>
+        <w:t>ời, nước đi mà AI cho là tối ưu cũng khác nhau ở hai độ sâu này</w:t>
       </w:r>
       <w:r>
         <w:rPr>
@@ -11143,8 +11441,7 @@
           <w:i/>
           <w:iCs/>
         </w:rPr>
-        <w:lastRenderedPageBreak/>
-        <w:t>nhau ở hai độ sâu này</w:t>
+        <w:t xml:space="preserve">. </w:t>
       </w:r>
       <w:r>
         <w:rPr>
@@ -11152,7 +11449,13 @@
           <w:i/>
           <w:iCs/>
         </w:rPr>
-        <w:t xml:space="preserve">. </w:t>
+        <w:t>Điều này là bởi ở độ sâu 3,</w:t>
+      </w:r>
+      <w:r>
+        <w:rPr>
+          <w:rFonts w:ascii="Times New Roman" w:hAnsi="Times New Roman" w:cs="Times New Roman"/>
+        </w:rPr>
+        <w:t xml:space="preserve"> </w:t>
       </w:r>
       <w:r>
         <w:rPr>
@@ -11160,13 +11463,7 @@
           <w:i/>
           <w:iCs/>
         </w:rPr>
-        <w:t>Điều này là bởi ở độ sâu 3,</w:t>
-      </w:r>
-      <w:r>
-        <w:rPr>
-          <w:rFonts w:ascii="Times New Roman" w:hAnsi="Times New Roman" w:cs="Times New Roman"/>
-        </w:rPr>
-        <w:t xml:space="preserve"> </w:t>
+        <w:t>AI phát hiện ra một nhánh thắng tuyệt đối. Con số 820,000 là mức điểm được gán cho các cấu trúc "sắp thắng". Nó cho thấy AI đã chuyển từ trạng thái "lo sợ bị đối thủ chặn" sang trạng thái "tự tin kết thúc ván đấu".</w:t>
       </w:r>
       <w:r>
         <w:rPr>
@@ -11174,7 +11471,7 @@
           <w:i/>
           <w:iCs/>
         </w:rPr>
-        <w:t>AI phát hiện ra một nhánh thắng tuyệt đối. Con số 820,000 là mức điểm được gán cho các cấu trúc "sắp thắng". Nó cho thấy AI đã chuyển từ trạng thái "lo sợ bị đối thủ chặn" sang trạng thái "tự tin kết thúc ván đấu".</w:t>
+        <w:t xml:space="preserve"> Và nước đi tiếp theo, AI sẽ giành chiến thắng với nước đi </w:t>
       </w:r>
       <w:r>
         <w:rPr>
@@ -11182,7 +11479,7 @@
           <w:i/>
           <w:iCs/>
         </w:rPr>
-        <w:t xml:space="preserve"> Và nước đi tiếp theo, AI sẽ giành chiến thắng với nước đi </w:t>
+        <w:t>(H</w:t>
       </w:r>
       <w:r>
         <w:rPr>
@@ -11190,7 +11487,7 @@
           <w:i/>
           <w:iCs/>
         </w:rPr>
-        <w:t>(H</w:t>
+        <w:t>3</w:t>
       </w:r>
       <w:r>
         <w:rPr>
@@ -11198,7 +11495,7 @@
           <w:i/>
           <w:iCs/>
         </w:rPr>
-        <w:t>3</w:t>
+        <w:t>,C</w:t>
       </w:r>
       <w:r>
         <w:rPr>
@@ -11206,7 +11503,7 @@
           <w:i/>
           <w:iCs/>
         </w:rPr>
-        <w:t>,C</w:t>
+        <w:t>4</w:t>
       </w:r>
       <w:r>
         <w:rPr>
@@ -11214,7 +11511,7 @@
           <w:i/>
           <w:iCs/>
         </w:rPr>
-        <w:t>4</w:t>
+        <w:t xml:space="preserve">) với Score </w:t>
       </w:r>
       <w:r>
         <w:rPr>
@@ -11222,7 +11519,7 @@
           <w:i/>
           <w:iCs/>
         </w:rPr>
-        <w:t xml:space="preserve">) với Score </w:t>
+        <w:t>820000</w:t>
       </w:r>
       <w:r>
         <w:rPr>
@@ -11230,25 +11527,8 @@
           <w:i/>
           <w:iCs/>
         </w:rPr>
-        <w:t>820000</w:t>
-      </w:r>
-      <w:r>
-        <w:rPr>
-          <w:rFonts w:ascii="Times New Roman" w:hAnsi="Times New Roman" w:cs="Times New Roman"/>
-          <w:i/>
-          <w:iCs/>
-        </w:rPr>
         <w:t>.</w:t>
       </w:r>
-    </w:p>
-    <w:p>
-      <w:pPr>
-        <w:rPr>
-          <w:rFonts w:ascii="Times New Roman" w:hAnsi="Times New Roman" w:cs="Times New Roman"/>
-          <w:i/>
-          <w:iCs/>
-        </w:rPr>
-      </w:pPr>
     </w:p>
     <w:p>
       <w:pPr>
@@ -12618,6 +12898,15 @@
           <w:iCs/>
         </w:rPr>
       </w:pPr>
+    </w:p>
+    <w:p>
+      <w:pPr>
+        <w:rPr>
+          <w:rFonts w:ascii="Times New Roman" w:hAnsi="Times New Roman" w:cs="Times New Roman"/>
+          <w:i/>
+          <w:iCs/>
+        </w:rPr>
+      </w:pPr>
       <w:r>
         <w:rPr>
           <w:rFonts w:ascii="Times New Roman" w:hAnsi="Times New Roman" w:cs="Times New Roman"/>
@@ -12700,6 +12989,15 @@
         </w:rPr>
         <w:t>à máy chủ động tấn công mà buộc phải vào trạng thái phòng thủ liên tục để tránh thua cuộc ngay lập tức.</w:t>
       </w:r>
+    </w:p>
+    <w:p>
+      <w:pPr>
+        <w:rPr>
+          <w:rFonts w:ascii="Times New Roman" w:hAnsi="Times New Roman" w:cs="Times New Roman"/>
+          <w:i/>
+          <w:iCs/>
+        </w:rPr>
+      </w:pPr>
     </w:p>
     <w:tbl>
       <w:tblPr>
@@ -14024,21 +14322,23 @@
           <w:iCs/>
         </w:rPr>
       </w:pPr>
-      <w:r>
+    </w:p>
+    <w:p>
+      <w:pPr>
+        <w:jc w:val="both"/>
         <w:rPr>
           <w:rFonts w:ascii="Times New Roman" w:hAnsi="Times New Roman" w:cs="Times New Roman"/>
           <w:i/>
           <w:iCs/>
         </w:rPr>
-        <w:t>Nước đi này là nước đi chưa tối ưu</w:t>
-      </w:r>
+      </w:pPr>
       <w:r>
         <w:rPr>
           <w:rFonts w:ascii="Times New Roman" w:hAnsi="Times New Roman" w:cs="Times New Roman"/>
           <w:i/>
           <w:iCs/>
         </w:rPr>
-        <w:t>, tuy người đã có chuỗi 3 quân X ở cột 2 nhưng máy lại đánh giá rằng ô (H5,C1) mới là nước đi tối ưu nhất</w:t>
+        <w:t>Nước đi này là nước đi chưa tối ưu</w:t>
       </w:r>
       <w:r>
         <w:rPr>
@@ -14046,7 +14346,7 @@
           <w:i/>
           <w:iCs/>
         </w:rPr>
-        <w:t>. Đây có thể là nguyên nhân đến từ</w:t>
+        <w:t>, tuy người đã có chuỗi 3 quân X ở cột 2 nhưng máy lại đánh giá rằng ô (H5,C1) mới là nước đi tối ưu nhất</w:t>
       </w:r>
       <w:r>
         <w:rPr>
@@ -14054,11 +14354,20 @@
           <w:i/>
           <w:iCs/>
         </w:rPr>
+        <w:t>. Đây có thể là nguyên nhân đến từ</w:t>
+      </w:r>
+      <w:r>
+        <w:rPr>
+          <w:rFonts w:ascii="Times New Roman" w:hAnsi="Times New Roman" w:cs="Times New Roman"/>
+          <w:i/>
+          <w:iCs/>
+        </w:rPr>
         <w:t xml:space="preserve"> hàm xử lý nước đi ưu tiên tìm nước đi tạo lợi thế cho máy trước khi kiểm tra mối đe dọa từ người chơi.</w:t>
       </w:r>
     </w:p>
     <w:p>
       <w:pPr>
+        <w:jc w:val="both"/>
         <w:rPr>
           <w:rFonts w:ascii="Times New Roman" w:hAnsi="Times New Roman" w:cs="Times New Roman"/>
           <w:b/>
@@ -14078,6 +14387,7 @@
     </w:p>
     <w:p>
       <w:pPr>
+        <w:jc w:val="both"/>
         <w:rPr>
           <w:rFonts w:ascii="Times New Roman" w:hAnsi="Times New Roman" w:cs="Times New Roman"/>
           <w:i/>
@@ -14090,6 +14400,7 @@
           <w:i/>
           <w:iCs/>
         </w:rPr>
+        <w:lastRenderedPageBreak/>
         <w:t>Các nước đi hợp lý</w:t>
       </w:r>
       <w:r>
@@ -14103,6 +14414,7 @@
     </w:p>
     <w:p>
       <w:pPr>
+        <w:jc w:val="both"/>
         <w:rPr>
           <w:rFonts w:ascii="Times New Roman" w:hAnsi="Times New Roman" w:cs="Times New Roman"/>
         </w:rPr>
@@ -14116,6 +14428,7 @@
     </w:p>
     <w:p>
       <w:pPr>
+        <w:jc w:val="both"/>
         <w:rPr>
           <w:rFonts w:ascii="Times New Roman" w:hAnsi="Times New Roman" w:cs="Times New Roman"/>
         </w:rPr>
@@ -14141,20 +14454,21 @@
     </w:p>
     <w:p>
       <w:pPr>
-        <w:rPr>
-          <w:rFonts w:ascii="Times New Roman" w:hAnsi="Times New Roman" w:cs="Times New Roman"/>
-        </w:rPr>
-      </w:pPr>
-      <w:r>
-        <w:rPr>
-          <w:rFonts w:ascii="Times New Roman" w:hAnsi="Times New Roman" w:cs="Times New Roman"/>
-        </w:rPr>
-        <w:lastRenderedPageBreak/>
+        <w:jc w:val="both"/>
+        <w:rPr>
+          <w:rFonts w:ascii="Times New Roman" w:hAnsi="Times New Roman" w:cs="Times New Roman"/>
+        </w:rPr>
+      </w:pPr>
+      <w:r>
+        <w:rPr>
+          <w:rFonts w:ascii="Times New Roman" w:hAnsi="Times New Roman" w:cs="Times New Roman"/>
+        </w:rPr>
         <w:t>Hình 3 &amp; Hình 4 (Tấn công dứt điểm): Việc sử dụng hàm find_urgent_move để kết thúc trận đấu trong 0.00s là minh chứng cho một hệ thống thông minh thực dụng. Máy không lãng phí tài nguyên tính toán khi đã nhìn thấy cơ hội thắng hiển nhiên.</w:t>
       </w:r>
     </w:p>
     <w:p>
       <w:pPr>
+        <w:jc w:val="both"/>
         <w:rPr>
           <w:rFonts w:ascii="Times New Roman" w:hAnsi="Times New Roman" w:cs="Times New Roman"/>
         </w:rPr>
@@ -14169,6 +14483,7 @@
     <w:p>
       <w:pPr>
         <w:ind w:firstLine="0"/>
+        <w:jc w:val="both"/>
         <w:rPr>
           <w:rFonts w:ascii="Times New Roman" w:hAnsi="Times New Roman" w:cs="Times New Roman"/>
           <w:i/>
@@ -14196,6 +14511,7 @@
     <w:p>
       <w:pPr>
         <w:ind w:firstLine="0"/>
+        <w:jc w:val="both"/>
         <w:rPr>
           <w:rFonts w:ascii="Times New Roman" w:hAnsi="Times New Roman" w:cs="Times New Roman"/>
         </w:rPr>
@@ -14237,12 +14553,35 @@
           <w:sz w:val="36"/>
           <w:szCs w:val="36"/>
         </w:rPr>
-        <w:t>11. NHẬN XÉT VỀ SỐ TRẠNG THÁI ĐÃ XÉT VÀ THỜI GIAN CHẠY</w:t>
+        <w:t>1</w:t>
+      </w:r>
+      <w:r>
+        <w:rPr>
+          <w:rFonts w:ascii="Times New Roman" w:hAnsi="Times New Roman" w:cs="Times New Roman"/>
+          <w:b/>
+          <w:bCs/>
+          <w:color w:val="auto"/>
+          <w:sz w:val="36"/>
+          <w:szCs w:val="36"/>
+        </w:rPr>
+        <w:t>2</w:t>
+      </w:r>
+      <w:r>
+        <w:rPr>
+          <w:rFonts w:ascii="Times New Roman" w:hAnsi="Times New Roman" w:cs="Times New Roman"/>
+          <w:b/>
+          <w:bCs/>
+          <w:color w:val="auto"/>
+          <w:sz w:val="36"/>
+          <w:szCs w:val="36"/>
+        </w:rPr>
+        <w:t>. NHẬN XÉT VỀ SỐ TRẠNG THÁI ĐÃ XÉT VÀ THỜI GIAN CHẠY</w:t>
       </w:r>
       <w:bookmarkEnd w:id="16"/>
     </w:p>
     <w:p>
       <w:pPr>
+        <w:jc w:val="both"/>
         <w:rPr>
           <w:rFonts w:ascii="Times New Roman" w:hAnsi="Times New Roman" w:cs="Times New Roman"/>
         </w:rPr>
@@ -14281,6 +14620,7 @@
     <w:p>
       <w:pPr>
         <w:ind w:left="720" w:firstLine="0"/>
+        <w:jc w:val="both"/>
         <w:rPr>
           <w:rFonts w:ascii="Times New Roman" w:hAnsi="Times New Roman" w:cs="Times New Roman"/>
         </w:rPr>
@@ -14298,6 +14638,7 @@
           <w:ilvl w:val="1"/>
           <w:numId w:val="39"/>
         </w:numPr>
+        <w:jc w:val="both"/>
         <w:rPr>
           <w:rFonts w:ascii="Times New Roman" w:hAnsi="Times New Roman" w:cs="Times New Roman"/>
         </w:rPr>
@@ -14327,6 +14668,7 @@
           <w:ilvl w:val="1"/>
           <w:numId w:val="39"/>
         </w:numPr>
+        <w:jc w:val="both"/>
         <w:rPr>
           <w:rFonts w:ascii="Times New Roman" w:hAnsi="Times New Roman" w:cs="Times New Roman"/>
         </w:rPr>
@@ -14352,6 +14694,7 @@
     </w:p>
     <w:p>
       <w:pPr>
+        <w:jc w:val="both"/>
         <w:rPr>
           <w:rFonts w:ascii="Times New Roman" w:hAnsi="Times New Roman" w:cs="Times New Roman"/>
         </w:rPr>
@@ -14371,6 +14714,7 @@
     </w:p>
     <w:p>
       <w:pPr>
+        <w:jc w:val="both"/>
         <w:rPr>
           <w:rFonts w:ascii="Times New Roman" w:hAnsi="Times New Roman" w:cs="Times New Roman"/>
         </w:rPr>
@@ -14389,6 +14733,7 @@
           <w:ilvl w:val="0"/>
           <w:numId w:val="45"/>
         </w:numPr>
+        <w:jc w:val="both"/>
         <w:rPr>
           <w:rFonts w:ascii="Times New Roman" w:hAnsi="Times New Roman" w:cs="Times New Roman"/>
         </w:rPr>
@@ -14407,6 +14752,7 @@
           <w:ilvl w:val="0"/>
           <w:numId w:val="45"/>
         </w:numPr>
+        <w:jc w:val="both"/>
         <w:rPr>
           <w:rFonts w:ascii="Times New Roman" w:hAnsi="Times New Roman" w:cs="Times New Roman"/>
         </w:rPr>
@@ -14425,6 +14771,7 @@
           <w:ilvl w:val="0"/>
           <w:numId w:val="45"/>
         </w:numPr>
+        <w:jc w:val="both"/>
         <w:rPr>
           <w:rFonts w:ascii="Times New Roman" w:hAnsi="Times New Roman" w:cs="Times New Roman"/>
         </w:rPr>
@@ -14463,6 +14810,7 @@
     <w:p>
       <w:pPr>
         <w:ind w:firstLine="360"/>
+        <w:jc w:val="both"/>
         <w:rPr>
           <w:rFonts w:ascii="Times New Roman" w:hAnsi="Times New Roman" w:cs="Times New Roman"/>
         </w:rPr>
@@ -14481,6 +14829,7 @@
           <w:i/>
           <w:iCs/>
         </w:rPr>
+        <w:lastRenderedPageBreak/>
         <w:t>find_urgent_move</w:t>
       </w:r>
       <w:r>
@@ -14509,11 +14858,32 @@
           <w:sz w:val="36"/>
           <w:szCs w:val="36"/>
         </w:rPr>
-        <w:t>12. NHẬN XÉT VỀ ẢNH HƯỞNG ĐỘ SÂU TÌM KIẾM</w:t>
+        <w:t>1</w:t>
+      </w:r>
+      <w:r>
+        <w:rPr>
+          <w:rFonts w:ascii="Times New Roman" w:hAnsi="Times New Roman" w:cs="Times New Roman"/>
+          <w:b/>
+          <w:bCs/>
+          <w:sz w:val="36"/>
+          <w:szCs w:val="36"/>
+        </w:rPr>
+        <w:t>3</w:t>
+      </w:r>
+      <w:r>
+        <w:rPr>
+          <w:rFonts w:ascii="Times New Roman" w:hAnsi="Times New Roman" w:cs="Times New Roman"/>
+          <w:b/>
+          <w:bCs/>
+          <w:sz w:val="36"/>
+          <w:szCs w:val="36"/>
+        </w:rPr>
+        <w:t>. NHẬN XÉT VỀ ẢNH HƯỞNG ĐỘ SÂU TÌM KIẾM</w:t>
       </w:r>
     </w:p>
     <w:p>
       <w:pPr>
+        <w:jc w:val="both"/>
         <w:rPr>
           <w:rFonts w:ascii="Times New Roman" w:hAnsi="Times New Roman" w:cs="Times New Roman"/>
         </w:rPr>
@@ -14535,6 +14905,7 @@
     </w:p>
     <w:p>
       <w:pPr>
+        <w:jc w:val="both"/>
         <w:rPr>
           <w:rFonts w:ascii="Times New Roman" w:hAnsi="Times New Roman" w:cs="Times New Roman"/>
         </w:rPr>
@@ -14560,15 +14931,15 @@
     </w:p>
     <w:p>
       <w:pPr>
-        <w:rPr>
-          <w:rFonts w:ascii="Times New Roman" w:hAnsi="Times New Roman" w:cs="Times New Roman"/>
-        </w:rPr>
-      </w:pPr>
-      <w:r>
-        <w:rPr>
-          <w:rFonts w:ascii="Times New Roman" w:hAnsi="Times New Roman" w:cs="Times New Roman"/>
-        </w:rPr>
-        <w:lastRenderedPageBreak/>
+        <w:jc w:val="both"/>
+        <w:rPr>
+          <w:rFonts w:ascii="Times New Roman" w:hAnsi="Times New Roman" w:cs="Times New Roman"/>
+        </w:rPr>
+      </w:pPr>
+      <w:r>
+        <w:rPr>
+          <w:rFonts w:ascii="Times New Roman" w:hAnsi="Times New Roman" w:cs="Times New Roman"/>
+        </w:rPr>
         <w:t xml:space="preserve">Minh chứng rõ nhất ở Hình 2: Tại </w:t>
       </w:r>
       <w:r>
@@ -14605,6 +14976,7 @@
     <w:p>
       <w:pPr>
         <w:spacing w:after="0" w:line="240" w:lineRule="auto"/>
+        <w:jc w:val="both"/>
         <w:rPr>
           <w:rFonts w:ascii="Times New Roman" w:eastAsia="Times New Roman" w:hAnsi="Times New Roman" w:cs="Times New Roman"/>
           <w:kern w:val="0"/>
@@ -14726,7 +15098,7 @@
           <w:sz w:val="36"/>
           <w:szCs w:val="36"/>
         </w:rPr>
-        <w:t>3</w:t>
+        <w:t>4</w:t>
       </w:r>
       <w:r>
         <w:rPr>
@@ -14764,152 +15136,9 @@
           <w:sz w:val="36"/>
           <w:szCs w:val="36"/>
         </w:rPr>
-        <w:t>13.1 Ưu điểm</w:t>
-      </w:r>
-      <w:bookmarkEnd w:id="18"/>
-    </w:p>
-    <w:p>
-      <w:pPr>
-        <w:rPr>
-          <w:rFonts w:ascii="Times New Roman" w:hAnsi="Times New Roman" w:cs="Times New Roman"/>
-        </w:rPr>
-      </w:pPr>
-      <w:r>
-        <w:rPr>
-          <w:rFonts w:ascii="Times New Roman" w:hAnsi="Times New Roman" w:cs="Times New Roman"/>
-        </w:rPr>
-        <w:t>Kết hợp phản xạ và tính toán: Chương trình không chỉ dùng thuật toán tìm kiếm mà còn có hàm find_urgent_move. Đây là điểm cực kỳ thông minh vì nó giúp AI "phản xạ" tức thì khi có thể thắng ngay hoặc cần chặn nước thắng của đối thủ mà không cần duyệt cây, giúp tiết kiệm tài nguyên tuyệt đối.</w:t>
-      </w:r>
-      <w:r>
-        <w:rPr>
-          <w:rFonts w:ascii="Times New Roman" w:hAnsi="Times New Roman" w:cs="Times New Roman"/>
-        </w:rPr>
-        <w:t xml:space="preserve"> Vì vậy, thời gian máy đưa ra quyết định nước đi tương đối hiệu quả.</w:t>
-      </w:r>
-    </w:p>
-    <w:p>
-      <w:pPr>
-        <w:rPr>
-          <w:rFonts w:ascii="Times New Roman" w:hAnsi="Times New Roman" w:cs="Times New Roman"/>
-        </w:rPr>
-      </w:pPr>
-      <w:r>
-        <w:rPr>
-          <w:rFonts w:ascii="Times New Roman" w:hAnsi="Times New Roman" w:cs="Times New Roman"/>
-        </w:rPr>
-        <w:t>Cơ chế cắt tỉa Alpha-Beta: Việc triển khai Alpha-Beta giúp AI nhìn sâu đến độ sâu 4 (Depth 4) trên bàn cờ 9x9 một cách mượt mà, loại bỏ hàng chục ngàn nhánh dư thừa so với Minimax thuần túy.</w:t>
-      </w:r>
-    </w:p>
-    <w:p>
-      <w:pPr>
-        <w:rPr>
-          <w:rFonts w:ascii="Times New Roman" w:hAnsi="Times New Roman" w:cs="Times New Roman"/>
-        </w:rPr>
-      </w:pPr>
-      <w:r>
-        <w:rPr>
-          <w:rFonts w:ascii="Times New Roman" w:hAnsi="Times New Roman" w:cs="Times New Roman"/>
-        </w:rPr>
-        <w:t>Trọng số linh hoạt: Hàm get_score_dir phân biệt rõ ràng giữa các trạng thái cờ: "3 quân thoáng" (điểm rất cao), "3 quân bị chặn một đầu" (điểm thấp hơn), và "4 quân" (thắng tuyệt đối).</w:t>
-      </w:r>
-    </w:p>
-    <w:p>
-      <w:pPr>
-        <w:rPr>
-          <w:rFonts w:ascii="Times New Roman" w:hAnsi="Times New Roman" w:cs="Times New Roman"/>
-        </w:rPr>
-      </w:pPr>
-      <w:r>
-        <w:rPr>
-          <w:rFonts w:ascii="Times New Roman" w:hAnsi="Times New Roman" w:cs="Times New Roman"/>
-        </w:rPr>
-        <w:t>Tư duy phòng thủ chủ động: AI có trọng số điểm cho người chơi (is_ai = False) thường cao hơn hoặc mang tính răn đe, giúp máy biết sợ và ưu tiên chặn đối thủ hơn là mải mê tấn công.</w:t>
-      </w:r>
-    </w:p>
-    <w:p>
-      <w:pPr>
-        <w:rPr>
-          <w:rFonts w:ascii="Times New Roman" w:hAnsi="Times New Roman" w:cs="Times New Roman"/>
-        </w:rPr>
-      </w:pPr>
-      <w:r>
-        <w:rPr>
-          <w:rFonts w:ascii="Times New Roman" w:hAnsi="Times New Roman" w:cs="Times New Roman"/>
-        </w:rPr>
-        <w:t xml:space="preserve">Ưu tiên vùng trung tâm: Hàm get_possible_moves sắp xếp các nước đi dựa trên khoảng cách tới tâm bàn cờ </w:t>
-      </w:r>
-      <w:r>
-        <w:rPr>
-          <w:rFonts w:ascii="Times New Roman" w:hAnsi="Times New Roman" w:cs="Times New Roman"/>
-          <w:b/>
-          <w:bCs/>
-          <w:i/>
-          <w:iCs/>
-        </w:rPr>
-        <w:t>(abs(x[0]-4) + abs(x[1]-4)).</w:t>
-      </w:r>
-      <w:r>
-        <w:rPr>
-          <w:rFonts w:ascii="Times New Roman" w:hAnsi="Times New Roman" w:cs="Times New Roman"/>
-        </w:rPr>
-        <w:t xml:space="preserve"> Điều này giúp AI luôn chiếm giữ các vị trí chiến lược ngay từ đầu trận.</w:t>
-      </w:r>
-    </w:p>
-    <w:p>
-      <w:pPr>
-        <w:rPr>
-          <w:rFonts w:ascii="Times New Roman" w:hAnsi="Times New Roman" w:cs="Times New Roman"/>
-        </w:rPr>
-      </w:pPr>
-      <w:r>
-        <w:rPr>
-          <w:rFonts w:ascii="Times New Roman" w:hAnsi="Times New Roman" w:cs="Times New Roman"/>
-        </w:rPr>
-        <w:t>Chế độ So sánh</w:t>
-      </w:r>
-      <w:r>
-        <w:rPr>
-          <w:rFonts w:ascii="Times New Roman" w:hAnsi="Times New Roman" w:cs="Times New Roman"/>
-        </w:rPr>
-        <w:t xml:space="preserve">: </w:t>
-      </w:r>
-      <w:r>
-        <w:rPr>
-          <w:rFonts w:ascii="Times New Roman" w:hAnsi="Times New Roman" w:cs="Times New Roman"/>
-        </w:rPr>
-        <w:t>Đây là tính năng "đắt giá" nhất cho báo cáo. Nó cho phép trực quan hóa sự khác biệt giữa các độ sâu và thuật toán (số Nodes, thời gian chạy).</w:t>
-      </w:r>
-    </w:p>
-    <w:p>
-      <w:pPr>
-        <w:rPr>
-          <w:rFonts w:ascii="Times New Roman" w:hAnsi="Times New Roman" w:cs="Times New Roman"/>
-        </w:rPr>
-      </w:pPr>
-      <w:r>
-        <w:rPr>
-          <w:rFonts w:ascii="Times New Roman" w:hAnsi="Times New Roman" w:cs="Times New Roman"/>
-        </w:rPr>
-        <w:t>Giao diện trực quan: Sử dụng thư viện tkinter gọn nhẹ, có highlight nước đi mới nhất của AI và đánh dấu chuỗi quân thắng cuộc bằng màu sắc rõ ràng.</w:t>
-      </w:r>
-    </w:p>
-    <w:p>
-      <w:pPr>
-        <w:rPr>
-          <w:rFonts w:ascii="Times New Roman" w:hAnsi="Times New Roman" w:cs="Times New Roman"/>
-        </w:rPr>
-      </w:pPr>
-      <w:r>
-        <w:rPr>
-          <w:rFonts w:ascii="Times New Roman" w:hAnsi="Times New Roman" w:cs="Times New Roman"/>
-        </w:rPr>
-        <w:t>Cơ chế Timeout: Hệ thống có TIME_LIMIT (5s) để ngăn chương trình bị treo (Not Responding) khi độ phức tạp tăng cao, đảm bảo tính ổn định.</w:t>
-      </w:r>
-    </w:p>
-    <w:p>
-      <w:pPr>
-        <w:pStyle w:val="Heading2"/>
-        <w:ind w:firstLine="0"/>
+        <w:t>1</w:t>
+      </w:r>
+      <w:r>
         <w:rPr>
           <w:rFonts w:ascii="Times New Roman" w:hAnsi="Times New Roman" w:cs="Times New Roman"/>
           <w:b/>
@@ -14918,8 +15147,8 @@
           <w:sz w:val="36"/>
           <w:szCs w:val="36"/>
         </w:rPr>
-      </w:pPr>
-      <w:bookmarkStart w:id="19" w:name="_Toc229416416"/>
+        <w:t>4</w:t>
+      </w:r>
       <w:r>
         <w:rPr>
           <w:rFonts w:ascii="Times New Roman" w:hAnsi="Times New Roman" w:cs="Times New Roman"/>
@@ -14929,29 +15158,147 @@
           <w:sz w:val="36"/>
           <w:szCs w:val="36"/>
         </w:rPr>
-        <w:t>13.2 Nhược điểm</w:t>
-      </w:r>
-      <w:bookmarkEnd w:id="19"/>
+        <w:t>.1 Ưu điểm</w:t>
+      </w:r>
+      <w:bookmarkEnd w:id="18"/>
     </w:p>
     <w:p>
       <w:pPr>
-        <w:rPr>
-          <w:rFonts w:ascii="Times New Roman" w:hAnsi="Times New Roman" w:cs="Times New Roman"/>
-        </w:rPr>
-      </w:pPr>
-      <w:r>
-        <w:rPr>
-          <w:rFonts w:ascii="Times New Roman" w:hAnsi="Times New Roman" w:cs="Times New Roman"/>
-        </w:rPr>
-        <w:t>Chưa nhận diện "nước đôi": AI hiện tại chủ yếu tính điểm trên từng đường đơn lẻ. Nó chưa có logic đặc biệt để nhận diện và ưu tiên tạo ra các "nước đôi" (cùng lúc tạo 2 đường 3 quân thoáng), vốn là cách thắng phổ biến nhất trong cờ Caro.</w:t>
+        <w:jc w:val="both"/>
+        <w:rPr>
+          <w:rFonts w:ascii="Times New Roman" w:hAnsi="Times New Roman" w:cs="Times New Roman"/>
+        </w:rPr>
+      </w:pPr>
+      <w:r>
+        <w:rPr>
+          <w:rFonts w:ascii="Times New Roman" w:hAnsi="Times New Roman" w:cs="Times New Roman"/>
+        </w:rPr>
+        <w:t>Kết hợp phản xạ và tính toán: Chương trình không chỉ dùng thuật toán tìm kiếm mà còn có hàm find_urgent_move. Đây là điểm cực kỳ thông minh vì nó giúp AI "phản xạ" tức thì khi có thể thắng ngay hoặc cần chặn nước thắng của đối thủ mà không cần duyệt cây, giúp tiết kiệm tài nguyên tuyệt đối.</w:t>
+      </w:r>
+      <w:r>
+        <w:rPr>
+          <w:rFonts w:ascii="Times New Roman" w:hAnsi="Times New Roman" w:cs="Times New Roman"/>
+        </w:rPr>
+        <w:t xml:space="preserve"> Vì vậy, thời gian máy đưa ra quyết định nước đi tương đối hiệu quả.</w:t>
       </w:r>
     </w:p>
     <w:p>
       <w:pPr>
-        <w:rPr>
-          <w:rFonts w:ascii="Times New Roman" w:hAnsi="Times New Roman" w:cs="Times New Roman"/>
-          <w:sz w:val="28"/>
-          <w:szCs w:val="28"/>
+        <w:jc w:val="both"/>
+        <w:rPr>
+          <w:rFonts w:ascii="Times New Roman" w:hAnsi="Times New Roman" w:cs="Times New Roman"/>
+        </w:rPr>
+      </w:pPr>
+      <w:r>
+        <w:rPr>
+          <w:rFonts w:ascii="Times New Roman" w:hAnsi="Times New Roman" w:cs="Times New Roman"/>
+        </w:rPr>
+        <w:t>Cơ chế cắt tỉa Alpha-Beta: Việc triển khai Alpha-Beta giúp AI nhìn sâu đến độ sâu 4 (Depth 4) trên bàn cờ 9x9 một cách mượt mà, loại bỏ hàng chục ngàn nhánh dư thừa so với Minimax thuần túy.</w:t>
+      </w:r>
+    </w:p>
+    <w:p>
+      <w:pPr>
+        <w:jc w:val="both"/>
+        <w:rPr>
+          <w:rFonts w:ascii="Times New Roman" w:hAnsi="Times New Roman" w:cs="Times New Roman"/>
+        </w:rPr>
+      </w:pPr>
+      <w:r>
+        <w:rPr>
+          <w:rFonts w:ascii="Times New Roman" w:hAnsi="Times New Roman" w:cs="Times New Roman"/>
+        </w:rPr>
+        <w:t>Trọng số linh hoạt: Hàm get_score_dir phân biệt rõ ràng giữa các trạng thái cờ: "3 quân thoáng" (điểm rất cao), "3 quân bị chặn một đầu" (điểm thấp hơn), và "4 quân" (thắng tuyệt đối).</w:t>
+      </w:r>
+    </w:p>
+    <w:p>
+      <w:pPr>
+        <w:jc w:val="both"/>
+        <w:rPr>
+          <w:rFonts w:ascii="Times New Roman" w:hAnsi="Times New Roman" w:cs="Times New Roman"/>
+        </w:rPr>
+      </w:pPr>
+      <w:r>
+        <w:rPr>
+          <w:rFonts w:ascii="Times New Roman" w:hAnsi="Times New Roman" w:cs="Times New Roman"/>
+        </w:rPr>
+        <w:t>Tư duy phòng thủ chủ động: AI có trọng số điểm cho người chơi (is_ai = False) thường cao hơn hoặc mang tính răn đe, giúp máy biết sợ và ưu tiên chặn đối thủ hơn là mải mê tấn công.</w:t>
+      </w:r>
+    </w:p>
+    <w:p>
+      <w:pPr>
+        <w:jc w:val="both"/>
+        <w:rPr>
+          <w:rFonts w:ascii="Times New Roman" w:hAnsi="Times New Roman" w:cs="Times New Roman"/>
+        </w:rPr>
+      </w:pPr>
+      <w:r>
+        <w:rPr>
+          <w:rFonts w:ascii="Times New Roman" w:hAnsi="Times New Roman" w:cs="Times New Roman"/>
+        </w:rPr>
+        <w:t xml:space="preserve">Ưu tiên vùng trung tâm: Hàm get_possible_moves sắp xếp các nước đi dựa trên khoảng cách tới tâm bàn cờ </w:t>
+      </w:r>
+      <w:r>
+        <w:rPr>
+          <w:rFonts w:ascii="Times New Roman" w:hAnsi="Times New Roman" w:cs="Times New Roman"/>
+          <w:b/>
+          <w:bCs/>
+          <w:i/>
+          <w:iCs/>
+        </w:rPr>
+        <w:t>(abs(x[0]-4) + abs(x[1]-4)).</w:t>
+      </w:r>
+      <w:r>
+        <w:rPr>
+          <w:rFonts w:ascii="Times New Roman" w:hAnsi="Times New Roman" w:cs="Times New Roman"/>
+        </w:rPr>
+        <w:t xml:space="preserve"> Điều này giúp AI luôn chiếm giữ các vị trí chiến lược ngay từ đầu trận.</w:t>
+      </w:r>
+    </w:p>
+    <w:p>
+      <w:pPr>
+        <w:jc w:val="both"/>
+        <w:rPr>
+          <w:rFonts w:ascii="Times New Roman" w:hAnsi="Times New Roman" w:cs="Times New Roman"/>
+        </w:rPr>
+      </w:pPr>
+      <w:r>
+        <w:rPr>
+          <w:rFonts w:ascii="Times New Roman" w:hAnsi="Times New Roman" w:cs="Times New Roman"/>
+        </w:rPr>
+        <w:t>Chế độ So sánh</w:t>
+      </w:r>
+      <w:r>
+        <w:rPr>
+          <w:rFonts w:ascii="Times New Roman" w:hAnsi="Times New Roman" w:cs="Times New Roman"/>
+        </w:rPr>
+        <w:t xml:space="preserve">: </w:t>
+      </w:r>
+      <w:r>
+        <w:rPr>
+          <w:rFonts w:ascii="Times New Roman" w:hAnsi="Times New Roman" w:cs="Times New Roman"/>
+        </w:rPr>
+        <w:t>Đây là tính năng "đắt giá" nhất cho báo cáo. Nó cho phép trực quan hóa sự khác biệt giữa các độ sâu và thuật toán (số Nodes, thời gian chạy).</w:t>
+      </w:r>
+    </w:p>
+    <w:p>
+      <w:pPr>
+        <w:jc w:val="both"/>
+        <w:rPr>
+          <w:rFonts w:ascii="Times New Roman" w:hAnsi="Times New Roman" w:cs="Times New Roman"/>
+        </w:rPr>
+      </w:pPr>
+      <w:r>
+        <w:rPr>
+          <w:rFonts w:ascii="Times New Roman" w:hAnsi="Times New Roman" w:cs="Times New Roman"/>
+        </w:rPr>
+        <w:t>Giao diện trực quan: Sử dụng thư viện tkinter gọn nhẹ, có highlight nước đi mới nhất của AI và đánh dấu chuỗi quân thắng cuộc bằng màu sắc rõ ràng.</w:t>
+      </w:r>
+    </w:p>
+    <w:p>
+      <w:pPr>
+        <w:jc w:val="both"/>
+        <w:rPr>
+          <w:rFonts w:ascii="Times New Roman" w:hAnsi="Times New Roman" w:cs="Times New Roman"/>
         </w:rPr>
       </w:pPr>
       <w:r>
@@ -14959,15 +15306,7 @@
           <w:rFonts w:ascii="Times New Roman" w:hAnsi="Times New Roman" w:cs="Times New Roman"/>
         </w:rPr>
         <w:lastRenderedPageBreak/>
-        <w:t>Sắp xếp nước đi (Move Ordering): Mặc dù có ưu tiên vùng trung tâm, nhưng AI chưa ưu tiên thử các nước đi có điểm Heuristic cao trước. Nếu Alpha-Beta thử các nước đi "tốt nhất" trước, nó sẽ cắt tỉa được nhiều nhánh hơn nữa</w:t>
-      </w:r>
-      <w:r>
-        <w:rPr>
-          <w:rFonts w:ascii="Times New Roman" w:hAnsi="Times New Roman" w:cs="Times New Roman"/>
-          <w:sz w:val="28"/>
-          <w:szCs w:val="28"/>
-        </w:rPr>
-        <w:t>.</w:t>
+        <w:t>Cơ chế Timeout: Hệ thống có TIME_LIMIT (5s) để ngăn chương trình bị treo (Not Responding) khi độ phức tạp tăng cao, đảm bảo tính ổn định.</w:t>
       </w:r>
     </w:p>
     <w:p>
@@ -14983,7 +15322,7 @@
           <w:szCs w:val="36"/>
         </w:rPr>
       </w:pPr>
-      <w:bookmarkStart w:id="20" w:name="_Toc229416417"/>
+      <w:bookmarkStart w:id="19" w:name="_Toc229416416"/>
       <w:r>
         <w:rPr>
           <w:rFonts w:ascii="Times New Roman" w:hAnsi="Times New Roman" w:cs="Times New Roman"/>
@@ -14993,9 +15332,8 @@
           <w:sz w:val="36"/>
           <w:szCs w:val="36"/>
         </w:rPr>
-        <w:t>13.3. Hướng phát triển</w:t>
-      </w:r>
-      <w:bookmarkEnd w:id="20"/>
+        <w:t>1</w:t>
+      </w:r>
       <w:r>
         <w:rPr>
           <w:rFonts w:ascii="Times New Roman" w:hAnsi="Times New Roman" w:cs="Times New Roman"/>
@@ -15005,76 +15343,9 @@
           <w:sz w:val="36"/>
           <w:szCs w:val="36"/>
         </w:rPr>
-        <w:t xml:space="preserve"> </w:t>
-      </w:r>
-    </w:p>
-    <w:p>
-      <w:pPr>
-        <w:rPr>
-          <w:rFonts w:ascii="Times New Roman" w:hAnsi="Times New Roman" w:cs="Times New Roman"/>
-        </w:rPr>
-      </w:pPr>
-      <w:r>
-        <w:rPr>
-          <w:rFonts w:ascii="Times New Roman" w:hAnsi="Times New Roman" w:cs="Times New Roman"/>
-        </w:rPr>
-        <w:t>Cải thiện</w:t>
-      </w:r>
-      <w:r>
-        <w:rPr>
-          <w:rFonts w:ascii="Times New Roman" w:hAnsi="Times New Roman" w:cs="Times New Roman"/>
-        </w:rPr>
-        <w:t xml:space="preserve"> trải nghiệm chơi: người chơi có thể tùy chỉnh kích thước bàn chơi, chuyển đổi luật thắng 4 quân thành 5 quân ( chuẩn quốc tế); gợi ý nước đi cho người chơi</w:t>
-      </w:r>
-      <w:r>
-        <w:rPr>
-          <w:rFonts w:ascii="Times New Roman" w:hAnsi="Times New Roman" w:cs="Times New Roman"/>
-        </w:rPr>
-        <w:t>; lưu lịch sử đấu</w:t>
-      </w:r>
-      <w:r>
-        <w:rPr>
-          <w:rFonts w:ascii="Times New Roman" w:hAnsi="Times New Roman" w:cs="Times New Roman"/>
-        </w:rPr>
-        <w:t>.</w:t>
-      </w:r>
-    </w:p>
-    <w:p>
-      <w:pPr>
-        <w:rPr>
-          <w:rFonts w:ascii="Times New Roman" w:hAnsi="Times New Roman" w:cs="Times New Roman"/>
-        </w:rPr>
-      </w:pPr>
-      <w:r>
-        <w:rPr>
-          <w:rFonts w:ascii="Times New Roman" w:hAnsi="Times New Roman" w:cs="Times New Roman"/>
-        </w:rPr>
-        <w:t>Nâng cấp hàm Heuristic: Hàm đánh giá hiện tại tính điểm dựa trên từng đường độc lập</w:t>
-      </w:r>
-      <w:r>
-        <w:rPr>
-          <w:rFonts w:ascii="Times New Roman" w:hAnsi="Times New Roman" w:cs="Times New Roman"/>
-        </w:rPr>
-        <w:t>, có thể bị bẫy bởi các “nước đôi”.</w:t>
-      </w:r>
-    </w:p>
-    <w:p>
-      <w:pPr>
-        <w:rPr>
-          <w:rFonts w:ascii="Times New Roman" w:hAnsi="Times New Roman" w:cs="Times New Roman"/>
-        </w:rPr>
-      </w:pPr>
-      <w:r>
-        <w:rPr>
-          <w:rFonts w:ascii="Times New Roman" w:hAnsi="Times New Roman" w:cs="Times New Roman"/>
-        </w:rPr>
-        <w:t>Bổ sung các kỹ thuật nâng cao như interative deepening, transposition table và Zobirst hashing.</w:t>
-      </w:r>
-    </w:p>
-    <w:p>
-      <w:pPr>
-        <w:pStyle w:val="Heading1"/>
-        <w:ind w:firstLine="0"/>
+        <w:t>4</w:t>
+      </w:r>
+      <w:r>
         <w:rPr>
           <w:rFonts w:ascii="Times New Roman" w:hAnsi="Times New Roman" w:cs="Times New Roman"/>
           <w:b/>
@@ -15083,9 +15354,52 @@
           <w:sz w:val="36"/>
           <w:szCs w:val="36"/>
         </w:rPr>
-      </w:pPr>
-      <w:bookmarkStart w:id="21" w:name="_Toc229416418"/>
-      <w:r>
+        <w:t>.2 Nhược điểm</w:t>
+      </w:r>
+      <w:bookmarkEnd w:id="19"/>
+    </w:p>
+    <w:p>
+      <w:pPr>
+        <w:jc w:val="both"/>
+        <w:rPr>
+          <w:rFonts w:ascii="Times New Roman" w:hAnsi="Times New Roman" w:cs="Times New Roman"/>
+        </w:rPr>
+      </w:pPr>
+      <w:r>
+        <w:rPr>
+          <w:rFonts w:ascii="Times New Roman" w:hAnsi="Times New Roman" w:cs="Times New Roman"/>
+        </w:rPr>
+        <w:t>Chưa nhận diện "nước đôi": AI hiện tại chủ yếu tính điểm trên từng đường đơn lẻ. Nó chưa có logic đặc biệt để nhận diện và ưu tiên tạo ra các "nước đôi" (cùng lúc tạo 2 đường 3 quân thoáng), vốn là cách thắng phổ biến nhất trong cờ Caro.</w:t>
+      </w:r>
+    </w:p>
+    <w:p>
+      <w:pPr>
+        <w:jc w:val="both"/>
+        <w:rPr>
+          <w:rFonts w:ascii="Times New Roman" w:hAnsi="Times New Roman" w:cs="Times New Roman"/>
+          <w:sz w:val="28"/>
+          <w:szCs w:val="28"/>
+        </w:rPr>
+      </w:pPr>
+      <w:r>
+        <w:rPr>
+          <w:rFonts w:ascii="Times New Roman" w:hAnsi="Times New Roman" w:cs="Times New Roman"/>
+        </w:rPr>
+        <w:t>Sắp xếp nước đi (Move Ordering): Mặc dù có ưu tiên vùng trung tâm, nhưng AI chưa ưu tiên thử các nước đi có điểm Heuristic cao trước. Nếu Alpha-Beta thử các nước đi "tốt nhất" trước, nó sẽ cắt tỉa được nhiều nhánh hơn nữa</w:t>
+      </w:r>
+      <w:r>
+        <w:rPr>
+          <w:rFonts w:ascii="Times New Roman" w:hAnsi="Times New Roman" w:cs="Times New Roman"/>
+          <w:sz w:val="28"/>
+          <w:szCs w:val="28"/>
+        </w:rPr>
+        <w:t>.</w:t>
+      </w:r>
+    </w:p>
+    <w:p>
+      <w:pPr>
+        <w:pStyle w:val="Heading2"/>
+        <w:ind w:firstLine="0"/>
         <w:rPr>
           <w:rFonts w:ascii="Times New Roman" w:hAnsi="Times New Roman" w:cs="Times New Roman"/>
           <w:b/>
@@ -15094,8 +15408,8 @@
           <w:sz w:val="36"/>
           <w:szCs w:val="36"/>
         </w:rPr>
-        <w:t>1</w:t>
-      </w:r>
+      </w:pPr>
+      <w:bookmarkStart w:id="20" w:name="_Toc229416417"/>
       <w:r>
         <w:rPr>
           <w:rFonts w:ascii="Times New Roman" w:hAnsi="Times New Roman" w:cs="Times New Roman"/>
@@ -15105,7 +15419,7 @@
           <w:sz w:val="36"/>
           <w:szCs w:val="36"/>
         </w:rPr>
-        <w:t>4</w:t>
+        <w:t>1</w:t>
       </w:r>
       <w:r>
         <w:rPr>
@@ -15116,6 +15430,141 @@
           <w:sz w:val="36"/>
           <w:szCs w:val="36"/>
         </w:rPr>
+        <w:t>4</w:t>
+      </w:r>
+      <w:r>
+        <w:rPr>
+          <w:rFonts w:ascii="Times New Roman" w:hAnsi="Times New Roman" w:cs="Times New Roman"/>
+          <w:b/>
+          <w:bCs/>
+          <w:color w:val="auto"/>
+          <w:sz w:val="36"/>
+          <w:szCs w:val="36"/>
+        </w:rPr>
+        <w:t>.3. Hướng phát triển</w:t>
+      </w:r>
+      <w:bookmarkEnd w:id="20"/>
+      <w:r>
+        <w:rPr>
+          <w:rFonts w:ascii="Times New Roman" w:hAnsi="Times New Roman" w:cs="Times New Roman"/>
+          <w:b/>
+          <w:bCs/>
+          <w:color w:val="auto"/>
+          <w:sz w:val="36"/>
+          <w:szCs w:val="36"/>
+        </w:rPr>
+        <w:t xml:space="preserve"> </w:t>
+      </w:r>
+    </w:p>
+    <w:p>
+      <w:pPr>
+        <w:jc w:val="both"/>
+        <w:rPr>
+          <w:rFonts w:ascii="Times New Roman" w:hAnsi="Times New Roman" w:cs="Times New Roman"/>
+        </w:rPr>
+      </w:pPr>
+      <w:r>
+        <w:rPr>
+          <w:rFonts w:ascii="Times New Roman" w:hAnsi="Times New Roman" w:cs="Times New Roman"/>
+        </w:rPr>
+        <w:t>Cải thiện</w:t>
+      </w:r>
+      <w:r>
+        <w:rPr>
+          <w:rFonts w:ascii="Times New Roman" w:hAnsi="Times New Roman" w:cs="Times New Roman"/>
+        </w:rPr>
+        <w:t xml:space="preserve"> trải nghiệm chơi: người chơi có thể tùy chỉnh kích thước bàn chơi, chuyển đổi luật thắng 4 quân thành 5 quân ( chuẩn quốc tế); gợi ý nước đi cho người chơi</w:t>
+      </w:r>
+      <w:r>
+        <w:rPr>
+          <w:rFonts w:ascii="Times New Roman" w:hAnsi="Times New Roman" w:cs="Times New Roman"/>
+        </w:rPr>
+        <w:t>; lưu lịch sử đấu</w:t>
+      </w:r>
+      <w:r>
+        <w:rPr>
+          <w:rFonts w:ascii="Times New Roman" w:hAnsi="Times New Roman" w:cs="Times New Roman"/>
+        </w:rPr>
+        <w:t>.</w:t>
+      </w:r>
+    </w:p>
+    <w:p>
+      <w:pPr>
+        <w:rPr>
+          <w:rFonts w:ascii="Times New Roman" w:hAnsi="Times New Roman" w:cs="Times New Roman"/>
+        </w:rPr>
+      </w:pPr>
+      <w:r>
+        <w:rPr>
+          <w:rFonts w:ascii="Times New Roman" w:hAnsi="Times New Roman" w:cs="Times New Roman"/>
+        </w:rPr>
+        <w:t>Nâng cấp hàm Heuristic: Hàm đánh giá hiện tại tính điểm dựa trên từng đường độc lập</w:t>
+      </w:r>
+      <w:r>
+        <w:rPr>
+          <w:rFonts w:ascii="Times New Roman" w:hAnsi="Times New Roman" w:cs="Times New Roman"/>
+        </w:rPr>
+        <w:t>, có thể bị bẫy bởi các “nước đôi”.</w:t>
+      </w:r>
+    </w:p>
+    <w:p>
+      <w:pPr>
+        <w:rPr>
+          <w:rFonts w:ascii="Times New Roman" w:hAnsi="Times New Roman" w:cs="Times New Roman"/>
+        </w:rPr>
+      </w:pPr>
+      <w:r>
+        <w:rPr>
+          <w:rFonts w:ascii="Times New Roman" w:hAnsi="Times New Roman" w:cs="Times New Roman"/>
+        </w:rPr>
+        <w:t>Bổ sung các kỹ thuật nâng cao như interative deepening, transposition table và Zobirst hashing.</w:t>
+      </w:r>
+    </w:p>
+    <w:p>
+      <w:pPr>
+        <w:pStyle w:val="Heading1"/>
+        <w:ind w:firstLine="0"/>
+        <w:rPr>
+          <w:rFonts w:ascii="Times New Roman" w:hAnsi="Times New Roman" w:cs="Times New Roman"/>
+          <w:b/>
+          <w:bCs/>
+          <w:color w:val="auto"/>
+          <w:sz w:val="36"/>
+          <w:szCs w:val="36"/>
+        </w:rPr>
+      </w:pPr>
+      <w:bookmarkStart w:id="21" w:name="_Toc229416418"/>
+      <w:r>
+        <w:rPr>
+          <w:rFonts w:ascii="Times New Roman" w:hAnsi="Times New Roman" w:cs="Times New Roman"/>
+          <w:b/>
+          <w:bCs/>
+          <w:color w:val="auto"/>
+          <w:sz w:val="36"/>
+          <w:szCs w:val="36"/>
+        </w:rPr>
+        <w:t>1</w:t>
+      </w:r>
+      <w:r>
+        <w:rPr>
+          <w:rFonts w:ascii="Times New Roman" w:hAnsi="Times New Roman" w:cs="Times New Roman"/>
+          <w:b/>
+          <w:bCs/>
+          <w:color w:val="auto"/>
+          <w:sz w:val="36"/>
+          <w:szCs w:val="36"/>
+        </w:rPr>
+        <w:t>5</w:t>
+      </w:r>
+      <w:r>
+        <w:rPr>
+          <w:rFonts w:ascii="Times New Roman" w:hAnsi="Times New Roman" w:cs="Times New Roman"/>
+          <w:b/>
+          <w:bCs/>
+          <w:color w:val="auto"/>
+          <w:sz w:val="36"/>
+          <w:szCs w:val="36"/>
+        </w:rPr>
         <w:t>. TÀI LIỆU THAM KHẢO VÀ PHẦN THAM KHẢO TỪ CÁC REPO MẪU</w:t>
       </w:r>
       <w:bookmarkEnd w:id="21"/>
@@ -15139,7 +15588,7 @@
           <w:bCs/>
           <w:color w:val="auto"/>
         </w:rPr>
-        <w:t>14.1. Tham khảo từ</w:t>
+        <w:t>1</w:t>
       </w:r>
       <w:r>
         <w:rPr>
@@ -15148,7 +15597,7 @@
           <w:bCs/>
           <w:color w:val="auto"/>
         </w:rPr>
-        <w:t xml:space="preserve"> dự án</w:t>
+        <w:t>5</w:t>
       </w:r>
       <w:r>
         <w:rPr>
@@ -15157,12 +15606,31 @@
           <w:bCs/>
           <w:color w:val="auto"/>
         </w:rPr>
+        <w:t>.1. Tham khảo từ</w:t>
+      </w:r>
+      <w:r>
+        <w:rPr>
+          <w:rFonts w:ascii="Times New Roman" w:hAnsi="Times New Roman" w:cs="Times New Roman"/>
+          <w:b/>
+          <w:bCs/>
+          <w:color w:val="auto"/>
+        </w:rPr>
+        <w:t xml:space="preserve"> dự án</w:t>
+      </w:r>
+      <w:r>
+        <w:rPr>
+          <w:rFonts w:ascii="Times New Roman" w:hAnsi="Times New Roman" w:cs="Times New Roman"/>
+          <w:b/>
+          <w:bCs/>
+          <w:color w:val="auto"/>
+        </w:rPr>
         <w:t xml:space="preserve"> gomokuAI-py</w:t>
       </w:r>
       <w:bookmarkEnd w:id="22"/>
     </w:p>
     <w:p>
       <w:pPr>
+        <w:jc w:val="both"/>
         <w:rPr>
           <w:rFonts w:ascii="Times New Roman" w:hAnsi="Times New Roman" w:cs="Times New Roman"/>
         </w:rPr>
@@ -15181,6 +15649,7 @@
           <w:ilvl w:val="0"/>
           <w:numId w:val="46"/>
         </w:numPr>
+        <w:jc w:val="both"/>
         <w:rPr>
           <w:rFonts w:ascii="Times New Roman" w:hAnsi="Times New Roman" w:cs="Times New Roman"/>
         </w:rPr>
@@ -15199,6 +15668,7 @@
           <w:ilvl w:val="0"/>
           <w:numId w:val="46"/>
         </w:numPr>
+        <w:jc w:val="both"/>
         <w:rPr>
           <w:rFonts w:ascii="Times New Roman" w:hAnsi="Times New Roman" w:cs="Times New Roman"/>
         </w:rPr>
@@ -15212,6 +15682,7 @@
     </w:p>
     <w:p>
       <w:pPr>
+        <w:jc w:val="both"/>
         <w:rPr>
           <w:rFonts w:ascii="Times New Roman" w:hAnsi="Times New Roman" w:cs="Times New Roman"/>
         </w:rPr>
@@ -15260,12 +15731,31 @@
           <w:bCs/>
           <w:color w:val="auto"/>
         </w:rPr>
-        <w:t>14.2. Tham khảo từ dự án Caro_AI</w:t>
+        <w:t>1</w:t>
+      </w:r>
+      <w:r>
+        <w:rPr>
+          <w:rFonts w:ascii="Times New Roman" w:hAnsi="Times New Roman" w:cs="Times New Roman"/>
+          <w:b/>
+          <w:bCs/>
+          <w:color w:val="auto"/>
+        </w:rPr>
+        <w:t>5</w:t>
+      </w:r>
+      <w:r>
+        <w:rPr>
+          <w:rFonts w:ascii="Times New Roman" w:hAnsi="Times New Roman" w:cs="Times New Roman"/>
+          <w:b/>
+          <w:bCs/>
+          <w:color w:val="auto"/>
+        </w:rPr>
+        <w:t>.2. Tham khảo từ dự án Caro_AI</w:t>
       </w:r>
       <w:bookmarkEnd w:id="23"/>
     </w:p>
     <w:p>
       <w:pPr>
+        <w:jc w:val="both"/>
         <w:rPr>
           <w:rFonts w:ascii="Times New Roman" w:hAnsi="Times New Roman" w:cs="Times New Roman"/>
         </w:rPr>
@@ -15275,6 +15765,25 @@
           <w:rFonts w:ascii="Times New Roman" w:hAnsi="Times New Roman" w:cs="Times New Roman"/>
         </w:rPr>
         <w:t>Những phần đã học hỏi:</w:t>
+      </w:r>
+    </w:p>
+    <w:p>
+      <w:pPr>
+        <w:pStyle w:val="ListParagraph"/>
+        <w:numPr>
+          <w:ilvl w:val="0"/>
+          <w:numId w:val="50"/>
+        </w:numPr>
+        <w:jc w:val="both"/>
+        <w:rPr>
+          <w:rFonts w:ascii="Times New Roman" w:hAnsi="Times New Roman" w:cs="Times New Roman"/>
+        </w:rPr>
+      </w:pPr>
+      <w:r>
+        <w:rPr>
+          <w:rFonts w:ascii="Times New Roman" w:hAnsi="Times New Roman" w:cs="Times New Roman"/>
+        </w:rPr>
+        <w:t>Đã học cách đóng gói và tải lên (upload) các tệp dự án lên kho lưu trữ GitHub. Qua đó, tạo ra không gian lưu trữ trực tuyến an toàn, giúp dễ dàng chia sẻ sản phẩm với giảng viên/đồng nghiệp và đính kèm đường link báo cáo minh chứng.</w:t>
       </w:r>
     </w:p>
     <w:p>
@@ -15284,14 +15793,16 @@
           <w:ilvl w:val="0"/>
           <w:numId w:val="47"/>
         </w:numPr>
-        <w:rPr>
-          <w:rFonts w:ascii="Times New Roman" w:hAnsi="Times New Roman" w:cs="Times New Roman"/>
-        </w:rPr>
-      </w:pPr>
-      <w:r>
-        <w:rPr>
-          <w:rFonts w:ascii="Times New Roman" w:hAnsi="Times New Roman" w:cs="Times New Roman"/>
-        </w:rPr>
+        <w:jc w:val="both"/>
+        <w:rPr>
+          <w:rFonts w:ascii="Times New Roman" w:hAnsi="Times New Roman" w:cs="Times New Roman"/>
+        </w:rPr>
+      </w:pPr>
+      <w:r>
+        <w:rPr>
+          <w:rFonts w:ascii="Times New Roman" w:hAnsi="Times New Roman" w:cs="Times New Roman"/>
+        </w:rPr>
+        <w:lastRenderedPageBreak/>
         <w:t>Cấu trúc Module: Học hỏi cách tách biệt rõ ràng giữa logic Game, giao diện UI và AI Agent để mã nguồn dễ quản lý và bảo trì.</w:t>
       </w:r>
     </w:p>
@@ -15302,6 +15813,7 @@
           <w:ilvl w:val="0"/>
           <w:numId w:val="47"/>
         </w:numPr>
+        <w:jc w:val="both"/>
         <w:rPr>
           <w:rFonts w:ascii="Times New Roman" w:hAnsi="Times New Roman" w:cs="Times New Roman"/>
         </w:rPr>
@@ -15320,6 +15832,7 @@
           <w:ilvl w:val="0"/>
           <w:numId w:val="47"/>
         </w:numPr>
+        <w:jc w:val="both"/>
         <w:rPr>
           <w:rFonts w:ascii="Times New Roman" w:hAnsi="Times New Roman" w:cs="Times New Roman"/>
         </w:rPr>
@@ -15344,6 +15857,7 @@
           <w:ilvl w:val="0"/>
           <w:numId w:val="47"/>
         </w:numPr>
+        <w:jc w:val="both"/>
         <w:rPr>
           <w:rFonts w:ascii="Times New Roman" w:hAnsi="Times New Roman" w:cs="Times New Roman"/>
         </w:rPr>
@@ -15364,6 +15878,7 @@
     <w:p>
       <w:pPr>
         <w:ind w:firstLine="0"/>
+        <w:jc w:val="both"/>
         <w:rPr>
           <w:rFonts w:ascii="Times New Roman" w:hAnsi="Times New Roman" w:cs="Times New Roman"/>
         </w:rPr>
@@ -15371,6 +15886,7 @@
     </w:p>
     <w:p>
       <w:pPr>
+        <w:jc w:val="both"/>
         <w:rPr>
           <w:rFonts w:ascii="Times New Roman" w:hAnsi="Times New Roman" w:cs="Times New Roman"/>
         </w:rPr>
@@ -15381,6 +15897,7 @@
         <w:ind w:firstLine="0"/>
         <w:rPr>
           <w:rFonts w:ascii="Times New Roman" w:hAnsi="Times New Roman" w:cs="Times New Roman"/>
+          <w:lang w:val="vi-VN"/>
         </w:rPr>
       </w:pPr>
     </w:p>
@@ -19725,6 +20242,119 @@
     </w:lvl>
   </w:abstractNum>
   <w:abstractNum w:abstractNumId="32" w15:restartNumberingAfterBreak="0">
+    <w:nsid w:val="55BB3166"/>
+    <w:multiLevelType w:val="hybridMultilevel"/>
+    <w:tmpl w:val="CBB8E68C"/>
+    <w:lvl w:ilvl="0" w:tplc="04090001">
+      <w:start w:val="1"/>
+      <w:numFmt w:val="bullet"/>
+      <w:lvlText w:val=""/>
+      <w:lvlJc w:val="left"/>
+      <w:pPr>
+        <w:ind w:left="720" w:hanging="360"/>
+      </w:pPr>
+      <w:rPr>
+        <w:rFonts w:ascii="Symbol" w:hAnsi="Symbol" w:hint="default"/>
+      </w:rPr>
+    </w:lvl>
+    <w:lvl w:ilvl="1" w:tplc="04090003" w:tentative="1">
+      <w:start w:val="1"/>
+      <w:numFmt w:val="bullet"/>
+      <w:lvlText w:val="o"/>
+      <w:lvlJc w:val="left"/>
+      <w:pPr>
+        <w:ind w:left="1440" w:hanging="360"/>
+      </w:pPr>
+      <w:rPr>
+        <w:rFonts w:ascii="Courier New" w:hAnsi="Courier New" w:cs="Courier New" w:hint="default"/>
+      </w:rPr>
+    </w:lvl>
+    <w:lvl w:ilvl="2" w:tplc="04090005" w:tentative="1">
+      <w:start w:val="1"/>
+      <w:numFmt w:val="bullet"/>
+      <w:lvlText w:val=""/>
+      <w:lvlJc w:val="left"/>
+      <w:pPr>
+        <w:ind w:left="2160" w:hanging="360"/>
+      </w:pPr>
+      <w:rPr>
+        <w:rFonts w:ascii="Wingdings" w:hAnsi="Wingdings" w:hint="default"/>
+      </w:rPr>
+    </w:lvl>
+    <w:lvl w:ilvl="3" w:tplc="04090001" w:tentative="1">
+      <w:start w:val="1"/>
+      <w:numFmt w:val="bullet"/>
+      <w:lvlText w:val=""/>
+      <w:lvlJc w:val="left"/>
+      <w:pPr>
+        <w:ind w:left="2880" w:hanging="360"/>
+      </w:pPr>
+      <w:rPr>
+        <w:rFonts w:ascii="Symbol" w:hAnsi="Symbol" w:hint="default"/>
+      </w:rPr>
+    </w:lvl>
+    <w:lvl w:ilvl="4" w:tplc="04090003" w:tentative="1">
+      <w:start w:val="1"/>
+      <w:numFmt w:val="bullet"/>
+      <w:lvlText w:val="o"/>
+      <w:lvlJc w:val="left"/>
+      <w:pPr>
+        <w:ind w:left="3600" w:hanging="360"/>
+      </w:pPr>
+      <w:rPr>
+        <w:rFonts w:ascii="Courier New" w:hAnsi="Courier New" w:cs="Courier New" w:hint="default"/>
+      </w:rPr>
+    </w:lvl>
+    <w:lvl w:ilvl="5" w:tplc="04090005" w:tentative="1">
+      <w:start w:val="1"/>
+      <w:numFmt w:val="bullet"/>
+      <w:lvlText w:val=""/>
+      <w:lvlJc w:val="left"/>
+      <w:pPr>
+        <w:ind w:left="4320" w:hanging="360"/>
+      </w:pPr>
+      <w:rPr>
+        <w:rFonts w:ascii="Wingdings" w:hAnsi="Wingdings" w:hint="default"/>
+      </w:rPr>
+    </w:lvl>
+    <w:lvl w:ilvl="6" w:tplc="04090001" w:tentative="1">
+      <w:start w:val="1"/>
+      <w:numFmt w:val="bullet"/>
+      <w:lvlText w:val=""/>
+      <w:lvlJc w:val="left"/>
+      <w:pPr>
+        <w:ind w:left="5040" w:hanging="360"/>
+      </w:pPr>
+      <w:rPr>
+        <w:rFonts w:ascii="Symbol" w:hAnsi="Symbol" w:hint="default"/>
+      </w:rPr>
+    </w:lvl>
+    <w:lvl w:ilvl="7" w:tplc="04090003" w:tentative="1">
+      <w:start w:val="1"/>
+      <w:numFmt w:val="bullet"/>
+      <w:lvlText w:val="o"/>
+      <w:lvlJc w:val="left"/>
+      <w:pPr>
+        <w:ind w:left="5760" w:hanging="360"/>
+      </w:pPr>
+      <w:rPr>
+        <w:rFonts w:ascii="Courier New" w:hAnsi="Courier New" w:cs="Courier New" w:hint="default"/>
+      </w:rPr>
+    </w:lvl>
+    <w:lvl w:ilvl="8" w:tplc="04090005" w:tentative="1">
+      <w:start w:val="1"/>
+      <w:numFmt w:val="bullet"/>
+      <w:lvlText w:val=""/>
+      <w:lvlJc w:val="left"/>
+      <w:pPr>
+        <w:ind w:left="6480" w:hanging="360"/>
+      </w:pPr>
+      <w:rPr>
+        <w:rFonts w:ascii="Wingdings" w:hAnsi="Wingdings" w:hint="default"/>
+      </w:rPr>
+    </w:lvl>
+  </w:abstractNum>
+  <w:abstractNum w:abstractNumId="33" w15:restartNumberingAfterBreak="0">
     <w:nsid w:val="55E15792"/>
     <w:multiLevelType w:val="multilevel"/>
     <w:tmpl w:val="81BEF4E8"/>
@@ -19837,7 +20467,7 @@
       </w:pPr>
     </w:lvl>
   </w:abstractNum>
-  <w:abstractNum w:abstractNumId="33" w15:restartNumberingAfterBreak="0">
+  <w:abstractNum w:abstractNumId="34" w15:restartNumberingAfterBreak="0">
     <w:nsid w:val="582E2142"/>
     <w:multiLevelType w:val="multilevel"/>
     <w:tmpl w:val="12AA749E"/>
@@ -19950,7 +20580,7 @@
       </w:pPr>
     </w:lvl>
   </w:abstractNum>
-  <w:abstractNum w:abstractNumId="34" w15:restartNumberingAfterBreak="0">
+  <w:abstractNum w:abstractNumId="35" w15:restartNumberingAfterBreak="0">
     <w:nsid w:val="5D106D46"/>
     <w:multiLevelType w:val="multilevel"/>
     <w:tmpl w:val="EA9AB884"/>
@@ -20099,7 +20729,7 @@
       </w:rPr>
     </w:lvl>
   </w:abstractNum>
-  <w:abstractNum w:abstractNumId="35" w15:restartNumberingAfterBreak="0">
+  <w:abstractNum w:abstractNumId="36" w15:restartNumberingAfterBreak="0">
     <w:nsid w:val="5F866CA2"/>
     <w:multiLevelType w:val="multilevel"/>
     <w:tmpl w:val="909C3F1C"/>
@@ -20248,7 +20878,7 @@
       </w:rPr>
     </w:lvl>
   </w:abstractNum>
-  <w:abstractNum w:abstractNumId="36" w15:restartNumberingAfterBreak="0">
+  <w:abstractNum w:abstractNumId="37" w15:restartNumberingAfterBreak="0">
     <w:nsid w:val="63242DB9"/>
     <w:multiLevelType w:val="multilevel"/>
     <w:tmpl w:val="B8E234F0"/>
@@ -20397,7 +21027,7 @@
       </w:rPr>
     </w:lvl>
   </w:abstractNum>
-  <w:abstractNum w:abstractNumId="37" w15:restartNumberingAfterBreak="0">
+  <w:abstractNum w:abstractNumId="38" w15:restartNumberingAfterBreak="0">
     <w:nsid w:val="6DD730DB"/>
     <w:multiLevelType w:val="multilevel"/>
     <w:tmpl w:val="09C08B68"/>
@@ -20510,7 +21140,7 @@
       </w:pPr>
     </w:lvl>
   </w:abstractNum>
-  <w:abstractNum w:abstractNumId="38" w15:restartNumberingAfterBreak="0">
+  <w:abstractNum w:abstractNumId="39" w15:restartNumberingAfterBreak="0">
     <w:nsid w:val="70861344"/>
     <w:multiLevelType w:val="multilevel"/>
     <w:tmpl w:val="95BE2DDC"/>
@@ -20659,7 +21289,7 @@
       </w:rPr>
     </w:lvl>
   </w:abstractNum>
-  <w:abstractNum w:abstractNumId="39" w15:restartNumberingAfterBreak="0">
+  <w:abstractNum w:abstractNumId="40" w15:restartNumberingAfterBreak="0">
     <w:nsid w:val="71411761"/>
     <w:multiLevelType w:val="hybridMultilevel"/>
     <w:tmpl w:val="30D6CA44"/>
@@ -20745,7 +21375,7 @@
       </w:pPr>
     </w:lvl>
   </w:abstractNum>
-  <w:abstractNum w:abstractNumId="40" w15:restartNumberingAfterBreak="0">
+  <w:abstractNum w:abstractNumId="41" w15:restartNumberingAfterBreak="0">
     <w:nsid w:val="77BE023B"/>
     <w:multiLevelType w:val="multilevel"/>
     <w:tmpl w:val="A4D403E0"/>
@@ -20894,7 +21524,7 @@
       </w:rPr>
     </w:lvl>
   </w:abstractNum>
-  <w:abstractNum w:abstractNumId="41" w15:restartNumberingAfterBreak="0">
+  <w:abstractNum w:abstractNumId="42" w15:restartNumberingAfterBreak="0">
     <w:nsid w:val="78DB317C"/>
     <w:multiLevelType w:val="hybridMultilevel"/>
     <w:tmpl w:val="59125A06"/>
@@ -21007,7 +21637,120 @@
       </w:rPr>
     </w:lvl>
   </w:abstractNum>
-  <w:abstractNum w:abstractNumId="42" w15:restartNumberingAfterBreak="0">
+  <w:abstractNum w:abstractNumId="43" w15:restartNumberingAfterBreak="0">
+    <w:nsid w:val="797E302D"/>
+    <w:multiLevelType w:val="hybridMultilevel"/>
+    <w:tmpl w:val="E8C6875A"/>
+    <w:lvl w:ilvl="0" w:tplc="04090001">
+      <w:start w:val="1"/>
+      <w:numFmt w:val="bullet"/>
+      <w:lvlText w:val=""/>
+      <w:lvlJc w:val="left"/>
+      <w:pPr>
+        <w:ind w:left="1287" w:hanging="360"/>
+      </w:pPr>
+      <w:rPr>
+        <w:rFonts w:ascii="Symbol" w:hAnsi="Symbol" w:hint="default"/>
+      </w:rPr>
+    </w:lvl>
+    <w:lvl w:ilvl="1" w:tplc="04090003" w:tentative="1">
+      <w:start w:val="1"/>
+      <w:numFmt w:val="bullet"/>
+      <w:lvlText w:val="o"/>
+      <w:lvlJc w:val="left"/>
+      <w:pPr>
+        <w:ind w:left="2007" w:hanging="360"/>
+      </w:pPr>
+      <w:rPr>
+        <w:rFonts w:ascii="Courier New" w:hAnsi="Courier New" w:cs="Courier New" w:hint="default"/>
+      </w:rPr>
+    </w:lvl>
+    <w:lvl w:ilvl="2" w:tplc="04090005" w:tentative="1">
+      <w:start w:val="1"/>
+      <w:numFmt w:val="bullet"/>
+      <w:lvlText w:val=""/>
+      <w:lvlJc w:val="left"/>
+      <w:pPr>
+        <w:ind w:left="2727" w:hanging="360"/>
+      </w:pPr>
+      <w:rPr>
+        <w:rFonts w:ascii="Wingdings" w:hAnsi="Wingdings" w:hint="default"/>
+      </w:rPr>
+    </w:lvl>
+    <w:lvl w:ilvl="3" w:tplc="04090001" w:tentative="1">
+      <w:start w:val="1"/>
+      <w:numFmt w:val="bullet"/>
+      <w:lvlText w:val=""/>
+      <w:lvlJc w:val="left"/>
+      <w:pPr>
+        <w:ind w:left="3447" w:hanging="360"/>
+      </w:pPr>
+      <w:rPr>
+        <w:rFonts w:ascii="Symbol" w:hAnsi="Symbol" w:hint="default"/>
+      </w:rPr>
+    </w:lvl>
+    <w:lvl w:ilvl="4" w:tplc="04090003" w:tentative="1">
+      <w:start w:val="1"/>
+      <w:numFmt w:val="bullet"/>
+      <w:lvlText w:val="o"/>
+      <w:lvlJc w:val="left"/>
+      <w:pPr>
+        <w:ind w:left="4167" w:hanging="360"/>
+      </w:pPr>
+      <w:rPr>
+        <w:rFonts w:ascii="Courier New" w:hAnsi="Courier New" w:cs="Courier New" w:hint="default"/>
+      </w:rPr>
+    </w:lvl>
+    <w:lvl w:ilvl="5" w:tplc="04090005" w:tentative="1">
+      <w:start w:val="1"/>
+      <w:numFmt w:val="bullet"/>
+      <w:lvlText w:val=""/>
+      <w:lvlJc w:val="left"/>
+      <w:pPr>
+        <w:ind w:left="4887" w:hanging="360"/>
+      </w:pPr>
+      <w:rPr>
+        <w:rFonts w:ascii="Wingdings" w:hAnsi="Wingdings" w:hint="default"/>
+      </w:rPr>
+    </w:lvl>
+    <w:lvl w:ilvl="6" w:tplc="04090001" w:tentative="1">
+      <w:start w:val="1"/>
+      <w:numFmt w:val="bullet"/>
+      <w:lvlText w:val=""/>
+      <w:lvlJc w:val="left"/>
+      <w:pPr>
+        <w:ind w:left="5607" w:hanging="360"/>
+      </w:pPr>
+      <w:rPr>
+        <w:rFonts w:ascii="Symbol" w:hAnsi="Symbol" w:hint="default"/>
+      </w:rPr>
+    </w:lvl>
+    <w:lvl w:ilvl="7" w:tplc="04090003" w:tentative="1">
+      <w:start w:val="1"/>
+      <w:numFmt w:val="bullet"/>
+      <w:lvlText w:val="o"/>
+      <w:lvlJc w:val="left"/>
+      <w:pPr>
+        <w:ind w:left="6327" w:hanging="360"/>
+      </w:pPr>
+      <w:rPr>
+        <w:rFonts w:ascii="Courier New" w:hAnsi="Courier New" w:cs="Courier New" w:hint="default"/>
+      </w:rPr>
+    </w:lvl>
+    <w:lvl w:ilvl="8" w:tplc="04090005" w:tentative="1">
+      <w:start w:val="1"/>
+      <w:numFmt w:val="bullet"/>
+      <w:lvlText w:val=""/>
+      <w:lvlJc w:val="left"/>
+      <w:pPr>
+        <w:ind w:left="7047" w:hanging="360"/>
+      </w:pPr>
+      <w:rPr>
+        <w:rFonts w:ascii="Wingdings" w:hAnsi="Wingdings" w:hint="default"/>
+      </w:rPr>
+    </w:lvl>
+  </w:abstractNum>
+  <w:abstractNum w:abstractNumId="44" w15:restartNumberingAfterBreak="0">
     <w:nsid w:val="7A0A35EE"/>
     <w:multiLevelType w:val="multilevel"/>
     <w:tmpl w:val="46F22EBE"/>
@@ -21156,7 +21899,7 @@
       </w:rPr>
     </w:lvl>
   </w:abstractNum>
-  <w:abstractNum w:abstractNumId="43" w15:restartNumberingAfterBreak="0">
+  <w:abstractNum w:abstractNumId="45" w15:restartNumberingAfterBreak="0">
     <w:nsid w:val="7EB36C4F"/>
     <w:multiLevelType w:val="multilevel"/>
     <w:tmpl w:val="D3225C9A"/>
@@ -21270,7 +22013,7 @@
     </w:lvl>
   </w:abstractNum>
   <w:num w:numId="1" w16cid:durableId="104546609">
-    <w:abstractNumId w:val="43"/>
+    <w:abstractNumId w:val="45"/>
   </w:num>
   <w:num w:numId="2" w16cid:durableId="1024021114">
     <w:abstractNumId w:val="21"/>
@@ -21299,7 +22042,7 @@
     <w:abstractNumId w:val="26"/>
   </w:num>
   <w:num w:numId="6" w16cid:durableId="2073309751">
-    <w:abstractNumId w:val="40"/>
+    <w:abstractNumId w:val="41"/>
   </w:num>
   <w:num w:numId="7" w16cid:durableId="86930471">
     <w:abstractNumId w:val="11"/>
@@ -21334,7 +22077,7 @@
     <w:abstractNumId w:val="18"/>
   </w:num>
   <w:num w:numId="13" w16cid:durableId="1225720971">
-    <w:abstractNumId w:val="32"/>
+    <w:abstractNumId w:val="33"/>
     <w:lvlOverride w:ilvl="0">
       <w:lvl w:ilvl="0">
         <w:numFmt w:val="decimal"/>
@@ -21347,10 +22090,10 @@
     <w:abstractNumId w:val="7"/>
   </w:num>
   <w:num w:numId="15" w16cid:durableId="819660716">
-    <w:abstractNumId w:val="33"/>
+    <w:abstractNumId w:val="34"/>
   </w:num>
   <w:num w:numId="16" w16cid:durableId="1620839384">
-    <w:abstractNumId w:val="33"/>
+    <w:abstractNumId w:val="34"/>
     <w:lvlOverride w:ilvl="0">
       <w:lvl w:ilvl="0">
         <w:numFmt w:val="decimal"/>
@@ -21380,7 +22123,7 @@
     </w:lvlOverride>
   </w:num>
   <w:num w:numId="19" w16cid:durableId="701245540">
-    <w:abstractNumId w:val="37"/>
+    <w:abstractNumId w:val="38"/>
     <w:lvlOverride w:ilvl="0">
       <w:lvl w:ilvl="0">
         <w:numFmt w:val="decimal"/>
@@ -21486,10 +22229,10 @@
     <w:abstractNumId w:val="8"/>
   </w:num>
   <w:num w:numId="28" w16cid:durableId="1240746398">
-    <w:abstractNumId w:val="35"/>
+    <w:abstractNumId w:val="36"/>
   </w:num>
   <w:num w:numId="29" w16cid:durableId="1428115324">
-    <w:abstractNumId w:val="38"/>
+    <w:abstractNumId w:val="39"/>
   </w:num>
   <w:num w:numId="30" w16cid:durableId="1897201861">
     <w:abstractNumId w:val="4"/>
@@ -21504,22 +22247,22 @@
     <w:abstractNumId w:val="14"/>
   </w:num>
   <w:num w:numId="34" w16cid:durableId="582109687">
-    <w:abstractNumId w:val="36"/>
+    <w:abstractNumId w:val="37"/>
   </w:num>
   <w:num w:numId="35" w16cid:durableId="1924488233">
     <w:abstractNumId w:val="0"/>
   </w:num>
   <w:num w:numId="36" w16cid:durableId="1326125469">
-    <w:abstractNumId w:val="42"/>
+    <w:abstractNumId w:val="44"/>
   </w:num>
   <w:num w:numId="37" w16cid:durableId="1380203184">
     <w:abstractNumId w:val="17"/>
   </w:num>
   <w:num w:numId="38" w16cid:durableId="496726489">
-    <w:abstractNumId w:val="39"/>
+    <w:abstractNumId w:val="40"/>
   </w:num>
   <w:num w:numId="39" w16cid:durableId="335230052">
-    <w:abstractNumId w:val="34"/>
+    <w:abstractNumId w:val="35"/>
   </w:num>
   <w:num w:numId="40" w16cid:durableId="1177036738">
     <w:abstractNumId w:val="3"/>
@@ -21543,10 +22286,16 @@
     <w:abstractNumId w:val="19"/>
   </w:num>
   <w:num w:numId="47" w16cid:durableId="1879707094">
-    <w:abstractNumId w:val="41"/>
+    <w:abstractNumId w:val="42"/>
   </w:num>
   <w:num w:numId="48" w16cid:durableId="62409669">
     <w:abstractNumId w:val="10"/>
+  </w:num>
+  <w:num w:numId="49" w16cid:durableId="42294921">
+    <w:abstractNumId w:val="43"/>
+  </w:num>
+  <w:num w:numId="50" w16cid:durableId="808668076">
+    <w:abstractNumId w:val="32"/>
   </w:num>
 </w:numbering>
 </file>
@@ -22153,7 +22902,6 @@
   <w:style w:type="character" w:default="1" w:styleId="DefaultParagraphFont">
     <w:name w:val="Default Paragraph Font"/>
     <w:uiPriority w:val="1"/>
-    <w:semiHidden/>
     <w:unhideWhenUsed/>
   </w:style>
   <w:style w:type="table" w:default="1" w:styleId="TableNormal">

</xml_diff>